<commit_message>
prototype: strengthen issue 122 gold set
Replace simplified fixtures with four complex positive samples and three aligned negative cases, backed by a dual-layer Gold definition and licensed public-source provenance.

Validated deterministic generation, Word 8-page rendering, document structure/a11y, and browser behavior at 1440/390/320 px.

docs/PROJECT.md four-state capability table: no change; this remains an isolated prototype awaiting product verdict.
</commit_message>
<xml_diff>
--- a/apps/api/src/prototypes/document-parsing-gold-set-122/output/documents/office-regression.docx
+++ b/apps/api/src/prototypes/document-parsing-gold-set-122/output/documents/office-regression.docx
@@ -4,71 +4,56 @@
   <w:body>
     <w:p>
       <w:pPr>
-        <w:spacing w:before="320" w:after="80"/>
+        <w:spacing w:after="1680"/>
+      </w:pPr>
+    </w:p>
+    <w:p>
+      <w:pPr>
+        <w:jc w:val="center"/>
       </w:pPr>
       <w:r>
         <w:rPr>
-          <w:rFonts w:ascii="Calibri" w:hAnsi="Calibri"/>
-          <w:b/>
-          <w:color w:val="000000"/>
-          <w:sz w:val="46"/>
+          <w:color w:val="7A5A00"/>
+          <w:sz w:val="20"/>
         </w:rPr>
-        <w:t>OFFICE RESEARCH REPORT</w:t>
+        <w:t>BENCHMARK BUSINESS BRIEF</w:t>
       </w:r>
     </w:p>
     <w:p>
       <w:pPr>
-        <w:spacing w:after="280"/>
+        <w:jc w:val="center"/>
       </w:pPr>
       <w:r>
         <w:rPr>
-          <w:rFonts w:ascii="Calibri" w:hAnsi="Calibri"/>
-          <w:color w:val="444444"/>
-          <w:sz w:val="26"/>
+          <w:b/>
+          <w:color w:val="203748"/>
+          <w:sz w:val="56"/>
         </w:rPr>
-        <w:t>Document parsing regression sample for Collector Issue #122</w:t>
+        <w:t>Recoverable Evidence Operations</w:t>
       </w:r>
     </w:p>
     <w:p>
       <w:pPr>
-        <w:spacing w:after="40"/>
+        <w:jc w:val="center"/>
       </w:pPr>
       <w:r>
         <w:rPr>
-          <w:b/>
+          <w:sz w:val="28"/>
         </w:rPr>
-        <w:t xml:space="preserve">Audience: </w:t>
-      </w:r>
-      <w:r>
-        <w:t>Research-tool evaluators</w:t>
+        <w:t>An eight-page office-document regression sample</w:t>
       </w:r>
     </w:p>
     <w:p>
       <w:pPr>
-        <w:spacing w:after="40"/>
+        <w:jc w:val="center"/>
       </w:pPr>
       <w:r>
-        <w:rPr>
-          <w:b/>
-        </w:rPr>
-        <w:t xml:space="preserve">Status: </w:t>
-      </w:r>
-      <w:r>
-        <w:t>Synthetic and public-safe</w:t>
+        <w:t>Original synthetic content · headings, lists, merged cells, tables, images, fields, and OOXML footnotes.</w:t>
       </w:r>
     </w:p>
     <w:p>
-      <w:pPr>
-        <w:spacing w:after="40"/>
-      </w:pPr>
       <w:r>
-        <w:rPr>
-          <w:b/>
-        </w:rPr>
-        <w:t xml:space="preserve">Purpose: </w:t>
-      </w:r>
-      <w:r>
-        <w:t>Office-document regression only; not the core research benchmark</w:t>
+        <w:br w:type="page"/>
       </w:r>
     </w:p>
     <w:p>
@@ -76,12 +61,12 @@
         <w:pStyle w:val="Heading1"/>
       </w:pPr>
       <w:r>
-        <w:t>1. Executive summary</w:t>
+        <w:t>Executive summary</w:t>
       </w:r>
     </w:p>
     <w:p>
       <w:r>
-        <w:t>This synthetic report checks whether a DOCX parser preserves headings, paragraphs, a real table, and an embedded image while keeping a stable paragraph-level location. It is intentionally ordinary: office documents are a regression group, not the benchmark's main research-material claim.</w:t>
+        <w:t>This document uses real Word styles and structures rather than visually imitated formatting. A useful parser should preserve headings, paragraph order, list levels, table cells, images, captions, and source-return notes.</w:t>
       </w:r>
     </w:p>
     <w:p>
@@ -89,12 +74,92 @@
         <w:pStyle w:val="Heading2"/>
       </w:pPr>
       <w:r>
-        <w:t>1.1 Decision criteria</w:t>
+        <w:t>Decision criteria</w:t>
       </w:r>
     </w:p>
     <w:p>
+      <w:pPr>
+        <w:pStyle w:val="ListNumber"/>
+        <w:ind w:left="720" w:hanging="360"/>
+        <w:numPr>
+          <w:ilvl w:val="0"/>
+          <w:numId w:val="5"/>
+        </w:numPr>
+      </w:pPr>
       <w:r>
-        <w:t>A candidate passes this sample when the reading order is intact, the heading ladder remains visible, table cells remain associated with their row and column, and the figure is reported as an image resource rather than fabricated prose.</w:t>
+        <w:t>Preserve semantic headings before styling details.</w:t>
+      </w:r>
+    </w:p>
+    <w:p>
+      <w:pPr>
+        <w:pStyle w:val="ListNumber"/>
+        <w:ind w:left="720" w:hanging="360"/>
+        <w:numPr>
+          <w:ilvl w:val="0"/>
+          <w:numId w:val="5"/>
+        </w:numPr>
+      </w:pPr>
+      <w:r>
+        <w:t>Keep lists as real numbered paragraphs, including nested levels.</w:t>
+      </w:r>
+    </w:p>
+    <w:p>
+      <w:pPr>
+        <w:pStyle w:val="ListNumber2"/>
+        <w:ind w:left="1080" w:hanging="360"/>
+        <w:numPr>
+          <w:ilvl w:val="1"/>
+          <w:numId w:val="5"/>
+        </w:numPr>
+      </w:pPr>
+      <w:r>
+        <w:t>Nested review: return each result to a source block.</w:t>
+      </w:r>
+    </w:p>
+    <w:p>
+      <w:pPr>
+        <w:pStyle w:val="ListNumber"/>
+        <w:ind w:left="720" w:hanging="360"/>
+        <w:numPr>
+          <w:ilvl w:val="0"/>
+          <w:numId w:val="5"/>
+        </w:numPr>
+      </w:pPr>
+      <w:r>
+        <w:t>Expose table merges and repeated headers without inventing cells.</w:t>
+      </w:r>
+    </w:p>
+    <w:p>
+      <w:pPr>
+        <w:pStyle w:val="ListNumber"/>
+        <w:ind w:left="720" w:hanging="360"/>
+        <w:numPr>
+          <w:ilvl w:val="0"/>
+          <w:numId w:val="5"/>
+        </w:numPr>
+      </w:pPr>
+      <w:r>
+        <w:t>Disclose missing images or footnotes explicitly.</w:t>
+      </w:r>
+    </w:p>
+    <w:p>
+      <w:pPr>
+        <w:pStyle w:val="Heading3"/>
+      </w:pPr>
+      <w:r>
+        <w:t>Source-return exception</w:t>
+      </w:r>
+    </w:p>
+    <w:p>
+      <w:r/>
+      <w:r>
+        <w:footnoteReference w:id="1"/>
+      </w:r>
+      <w:r/>
+    </w:p>
+    <w:p>
+      <w:r>
+        <w:br w:type="page"/>
       </w:r>
     </w:p>
     <w:p>
@@ -102,21 +167,30 @@
         <w:pStyle w:val="Heading1"/>
       </w:pPr>
       <w:r>
-        <w:t>2. Observed results</w:t>
+        <w:t>Observed results</w:t>
+      </w:r>
+    </w:p>
+    <w:p>
+      <w:pPr>
+        <w:pStyle w:val="Heading2"/>
+      </w:pPr>
+      <w:r>
+        <w:t>Merged-cell decision matrix</w:t>
       </w:r>
     </w:p>
     <w:tbl>
       <w:tblPr>
-        <w:tblW w:type="dxa" w:w="9360"/>
+        <w:tblStyle w:val="TableGrid"/>
         <w:jc w:val="left"/>
         <w:tblLayout w:type="fixed"/>
         <w:tblLook w:firstColumn="1" w:firstRow="1" w:lastColumn="0" w:lastRow="0" w:noHBand="0" w:noVBand="1" w:val="04A0"/>
-        <w:tblInd w:w="120" w:type="dxa"/>
+        <w:tblW w:w="9360" w:type="dxa"/>
+        <w:tblInd w:w="80" w:type="dxa"/>
       </w:tblPr>
       <w:tblGrid>
-        <w:gridCol w:w="2400"/>
-        <w:gridCol w:w="3480"/>
-        <w:gridCol w:w="3480"/>
+        <w:gridCol w:w="2100"/>
+        <w:gridCol w:w="3660"/>
+        <w:gridCol w:w="3600"/>
       </w:tblGrid>
       <w:tr>
         <w:trPr>
@@ -124,27 +198,437 @@
         </w:trPr>
         <w:tc>
           <w:tcPr>
-            <w:tcW w:type="dxa" w:w="2400"/>
-            <w:vAlign w:val="center"/>
-            <w:shd w:fill="F2F4F7"/>
+            <w:gridSpan w:val="3"/>
             <w:tcMar>
-              <w:top w:w="80" w:type="dxa"/>
-              <w:start w:w="120" w:type="dxa"/>
-              <w:bottom w:w="80" w:type="dxa"/>
-              <w:end w:w="120" w:type="dxa"/>
+              <w:top w:w="45" w:type="dxa"/>
+              <w:start w:w="80" w:type="dxa"/>
+              <w:bottom w:w="45" w:type="dxa"/>
+              <w:end w:w="80" w:type="dxa"/>
             </w:tcMar>
+            <w:tcW w:w="9360" w:type="dxa"/>
+            <w:shd w:fill="E8EEF5"/>
           </w:tcPr>
           <w:p>
             <w:pPr>
-              <w:spacing w:after="0"/>
+              <w:spacing w:after="0" w:line="216" w:lineRule="auto"/>
             </w:pPr>
             <w:r>
               <w:rPr>
-                <w:rFonts w:ascii="Calibri" w:hAnsi="Calibri"/>
-                <w:b/>
-                <w:sz w:val="20"/>
+                <w:sz w:val="16"/>
               </w:rPr>
-              <w:t>Parser mode</w:t>
+              <w:t>Evidence recovery decision matrix</w:t>
+            </w:r>
+          </w:p>
+        </w:tc>
+      </w:tr>
+      <w:tr>
+        <w:trPr>
+          <w:tblHeader w:val="true"/>
+        </w:trPr>
+        <w:tc>
+          <w:tcPr>
+            <w:tcMar>
+              <w:top w:w="45" w:type="dxa"/>
+              <w:start w:w="80" w:type="dxa"/>
+              <w:bottom w:w="45" w:type="dxa"/>
+              <w:end w:w="80" w:type="dxa"/>
+            </w:tcMar>
+            <w:tcW w:w="2100" w:type="dxa"/>
+            <w:shd w:fill="F2F4F7"/>
+          </w:tcPr>
+          <w:p>
+            <w:pPr>
+              <w:spacing w:after="0" w:line="216" w:lineRule="auto"/>
+            </w:pPr>
+            <w:r>
+              <w:rPr>
+                <w:sz w:val="16"/>
+              </w:rPr>
+              <w:t>Object</w:t>
+            </w:r>
+          </w:p>
+        </w:tc>
+        <w:tc>
+          <w:tcPr>
+            <w:tcMar>
+              <w:top w:w="45" w:type="dxa"/>
+              <w:start w:w="80" w:type="dxa"/>
+              <w:bottom w:w="45" w:type="dxa"/>
+              <w:end w:w="80" w:type="dxa"/>
+            </w:tcMar>
+            <w:tcW w:w="3660" w:type="dxa"/>
+            <w:shd w:fill="F2F4F7"/>
+          </w:tcPr>
+          <w:p>
+            <w:pPr>
+              <w:spacing w:after="0" w:line="216" w:lineRule="auto"/>
+            </w:pPr>
+            <w:r>
+              <w:rPr>
+                <w:sz w:val="16"/>
+              </w:rPr>
+              <w:t>Recovery expectation</w:t>
+            </w:r>
+          </w:p>
+        </w:tc>
+        <w:tc>
+          <w:tcPr>
+            <w:tcMar>
+              <w:top w:w="45" w:type="dxa"/>
+              <w:start w:w="80" w:type="dxa"/>
+              <w:bottom w:w="45" w:type="dxa"/>
+              <w:end w:w="80" w:type="dxa"/>
+            </w:tcMar>
+            <w:tcW w:w="3600" w:type="dxa"/>
+            <w:shd w:fill="F2F4F7"/>
+          </w:tcPr>
+          <w:p>
+            <w:pPr>
+              <w:spacing w:after="0" w:line="216" w:lineRule="auto"/>
+            </w:pPr>
+            <w:r>
+              <w:rPr>
+                <w:sz w:val="16"/>
+              </w:rPr>
+              <w:t>Honest downgrade</w:t>
+            </w:r>
+          </w:p>
+        </w:tc>
+      </w:tr>
+      <w:tr>
+        <w:tc>
+          <w:tcPr>
+            <w:tcMar>
+              <w:top w:w="45" w:type="dxa"/>
+              <w:start w:w="80" w:type="dxa"/>
+              <w:bottom w:w="45" w:type="dxa"/>
+              <w:end w:w="80" w:type="dxa"/>
+            </w:tcMar>
+            <w:tcW w:w="2100" w:type="dxa"/>
+            <w:vAlign w:val="center"/>
+          </w:tcPr>
+          <w:p>
+            <w:pPr>
+              <w:spacing w:after="0" w:line="216" w:lineRule="auto"/>
+            </w:pPr>
+            <w:r>
+              <w:rPr>
+                <w:sz w:val="16"/>
+              </w:rPr>
+              <w:t>Headings</w:t>
+            </w:r>
+          </w:p>
+        </w:tc>
+        <w:tc>
+          <w:tcPr>
+            <w:tcMar>
+              <w:top w:w="45" w:type="dxa"/>
+              <w:start w:w="80" w:type="dxa"/>
+              <w:bottom w:w="45" w:type="dxa"/>
+              <w:end w:w="80" w:type="dxa"/>
+            </w:tcMar>
+            <w:tcW w:w="3660" w:type="dxa"/>
+            <w:vAlign w:val="center"/>
+          </w:tcPr>
+          <w:p>
+            <w:pPr>
+              <w:spacing w:after="0" w:line="216" w:lineRule="auto"/>
+            </w:pPr>
+            <w:r>
+              <w:rPr>
+                <w:sz w:val="16"/>
+              </w:rPr>
+              <w:t>Style hierarchy and sequence</w:t>
+            </w:r>
+          </w:p>
+        </w:tc>
+        <w:tc>
+          <w:tcPr>
+            <w:tcMar>
+              <w:top w:w="45" w:type="dxa"/>
+              <w:start w:w="80" w:type="dxa"/>
+              <w:bottom w:w="45" w:type="dxa"/>
+              <w:end w:w="80" w:type="dxa"/>
+            </w:tcMar>
+            <w:tcW w:w="3600" w:type="dxa"/>
+            <w:vAlign w:val="center"/>
+          </w:tcPr>
+          <w:p>
+            <w:pPr>
+              <w:spacing w:after="0" w:line="216" w:lineRule="auto"/>
+            </w:pPr>
+            <w:r>
+              <w:rPr>
+                <w:sz w:val="16"/>
+              </w:rPr>
+              <w:t>Keep raw text with hierarchy unknown</w:t>
+            </w:r>
+          </w:p>
+        </w:tc>
+      </w:tr>
+      <w:tr>
+        <w:tc>
+          <w:tcPr>
+            <w:tcMar>
+              <w:top w:w="45" w:type="dxa"/>
+              <w:start w:w="80" w:type="dxa"/>
+              <w:bottom w:w="45" w:type="dxa"/>
+              <w:end w:w="80" w:type="dxa"/>
+            </w:tcMar>
+            <w:tcW w:w="2100" w:type="dxa"/>
+            <w:vAlign w:val="center"/>
+          </w:tcPr>
+          <w:p>
+            <w:pPr>
+              <w:spacing w:after="0" w:line="216" w:lineRule="auto"/>
+            </w:pPr>
+            <w:r>
+              <w:rPr>
+                <w:sz w:val="16"/>
+              </w:rPr>
+              <w:t>Footnotes</w:t>
+            </w:r>
+          </w:p>
+        </w:tc>
+        <w:tc>
+          <w:tcPr>
+            <w:tcMar>
+              <w:top w:w="45" w:type="dxa"/>
+              <w:start w:w="80" w:type="dxa"/>
+              <w:bottom w:w="45" w:type="dxa"/>
+              <w:end w:w="80" w:type="dxa"/>
+            </w:tcMar>
+            <w:tcW w:w="3660" w:type="dxa"/>
+            <w:vAlign w:val="center"/>
+          </w:tcPr>
+          <w:p>
+            <w:pPr>
+              <w:spacing w:after="0" w:line="216" w:lineRule="auto"/>
+            </w:pPr>
+            <w:r>
+              <w:rPr>
+                <w:sz w:val="16"/>
+              </w:rPr>
+              <w:t>Reference and note body</w:t>
+            </w:r>
+          </w:p>
+        </w:tc>
+        <w:tc>
+          <w:tcPr>
+            <w:tcMar>
+              <w:top w:w="45" w:type="dxa"/>
+              <w:start w:w="80" w:type="dxa"/>
+              <w:bottom w:w="45" w:type="dxa"/>
+              <w:end w:w="80" w:type="dxa"/>
+            </w:tcMar>
+            <w:tcW w:w="3600" w:type="dxa"/>
+            <w:vAlign w:val="center"/>
+          </w:tcPr>
+          <w:p>
+            <w:pPr>
+              <w:spacing w:after="0" w:line="216" w:lineRule="auto"/>
+            </w:pPr>
+            <w:r>
+              <w:rPr>
+                <w:sz w:val="16"/>
+              </w:rPr>
+              <w:t>Report note as unavailable</w:t>
+            </w:r>
+          </w:p>
+        </w:tc>
+      </w:tr>
+    </w:tbl>
+    <w:p>
+      <w:pPr>
+        <w:pStyle w:val="Caption"/>
+      </w:pPr>
+      <w:r>
+        <w:t>Table 1. Merged title row and structured body cells.</w:t>
+      </w:r>
+    </w:p>
+    <w:p>
+      <w:r>
+        <w:br w:type="page"/>
+      </w:r>
+    </w:p>
+    <w:p>
+      <w:pPr>
+        <w:pStyle w:val="Heading1"/>
+      </w:pPr>
+      <w:r>
+        <w:t>Cross-page review register</w:t>
+      </w:r>
+    </w:p>
+    <w:p>
+      <w:r>
+        <w:t>The register contains 32 distinct records. Its first row is a repeating header and the row height makes the table continue from page 4 onto page 5 in Microsoft Word.</w:t>
+      </w:r>
+    </w:p>
+    <w:tbl>
+      <w:tblPr>
+        <w:tblStyle w:val="TableGrid"/>
+        <w:jc w:val="left"/>
+        <w:tblLayout w:type="fixed"/>
+        <w:tblLook w:firstColumn="1" w:firstRow="1" w:lastColumn="0" w:lastRow="0" w:noHBand="0" w:noVBand="1" w:val="04A0"/>
+        <w:tblW w:w="8960" w:type="dxa"/>
+        <w:tblInd w:w="80" w:type="dxa"/>
+      </w:tblPr>
+      <w:tblGrid>
+        <w:gridCol w:w="780"/>
+        <w:gridCol w:w="2100"/>
+        <w:gridCol w:w="2600"/>
+        <w:gridCol w:w="3480"/>
+      </w:tblGrid>
+      <w:tr>
+        <w:trPr>
+          <w:tblHeader w:val="true"/>
+          <w:trHeight w:val="360" w:hRule="atLeast"/>
+        </w:trPr>
+        <w:tc>
+          <w:tcPr>
+            <w:tcMar>
+              <w:top w:w="45" w:type="dxa"/>
+              <w:start w:w="80" w:type="dxa"/>
+              <w:bottom w:w="45" w:type="dxa"/>
+              <w:end w:w="80" w:type="dxa"/>
+            </w:tcMar>
+            <w:tcW w:w="780" w:type="dxa"/>
+            <w:shd w:fill="F2F4F7"/>
+          </w:tcPr>
+          <w:p>
+            <w:pPr>
+              <w:spacing w:after="0" w:line="216" w:lineRule="auto"/>
+            </w:pPr>
+            <w:r>
+              <w:rPr>
+                <w:sz w:val="16"/>
+              </w:rPr>
+              <w:t>ID</w:t>
+            </w:r>
+          </w:p>
+        </w:tc>
+        <w:tc>
+          <w:tcPr>
+            <w:tcMar>
+              <w:top w:w="45" w:type="dxa"/>
+              <w:start w:w="80" w:type="dxa"/>
+              <w:bottom w:w="45" w:type="dxa"/>
+              <w:end w:w="80" w:type="dxa"/>
+            </w:tcMar>
+            <w:tcW w:w="2100" w:type="dxa"/>
+            <w:shd w:fill="F2F4F7"/>
+          </w:tcPr>
+          <w:p>
+            <w:pPr>
+              <w:spacing w:after="0" w:line="216" w:lineRule="auto"/>
+            </w:pPr>
+            <w:r>
+              <w:rPr>
+                <w:sz w:val="16"/>
+              </w:rPr>
+              <w:t>Object</w:t>
+            </w:r>
+          </w:p>
+        </w:tc>
+        <w:tc>
+          <w:tcPr>
+            <w:tcMar>
+              <w:top w:w="45" w:type="dxa"/>
+              <w:start w:w="80" w:type="dxa"/>
+              <w:bottom w:w="45" w:type="dxa"/>
+              <w:end w:w="80" w:type="dxa"/>
+            </w:tcMar>
+            <w:tcW w:w="2600" w:type="dxa"/>
+            <w:shd w:fill="F2F4F7"/>
+          </w:tcPr>
+          <w:p>
+            <w:pPr>
+              <w:spacing w:after="0" w:line="216" w:lineRule="auto"/>
+            </w:pPr>
+            <w:r>
+              <w:rPr>
+                <w:sz w:val="16"/>
+              </w:rPr>
+              <w:t>Expected recovery</w:t>
+            </w:r>
+          </w:p>
+        </w:tc>
+        <w:tc>
+          <w:tcPr>
+            <w:tcMar>
+              <w:top w:w="45" w:type="dxa"/>
+              <w:start w:w="80" w:type="dxa"/>
+              <w:bottom w:w="45" w:type="dxa"/>
+              <w:end w:w="80" w:type="dxa"/>
+            </w:tcMar>
+            <w:tcW w:w="3480" w:type="dxa"/>
+            <w:shd w:fill="F2F4F7"/>
+          </w:tcPr>
+          <w:p>
+            <w:pPr>
+              <w:spacing w:after="0" w:line="216" w:lineRule="auto"/>
+            </w:pPr>
+            <w:r>
+              <w:rPr>
+                <w:sz w:val="16"/>
+              </w:rPr>
+              <w:t>Failure disclosure</w:t>
+            </w:r>
+          </w:p>
+        </w:tc>
+      </w:tr>
+      <w:tr>
+        <w:trPr>
+          <w:trHeight w:val="720" w:hRule="atLeast"/>
+        </w:trPr>
+        <w:tc>
+          <w:tcPr>
+            <w:tcW w:type="dxa" w:w="780"/>
+            <w:vAlign w:val="center"/>
+          </w:tcPr>
+          <w:p>
+            <w:pPr>
+              <w:spacing w:after="0" w:line="216" w:lineRule="auto"/>
+            </w:pPr>
+            <w:r>
+              <w:rPr>
+                <w:sz w:val="16"/>
+              </w:rPr>
+              <w:t>R-01</w:t>
+            </w:r>
+          </w:p>
+        </w:tc>
+        <w:tc>
+          <w:tcPr>
+            <w:tcW w:type="dxa" w:w="2100"/>
+            <w:vAlign w:val="center"/>
+          </w:tcPr>
+          <w:p>
+            <w:pPr>
+              <w:spacing w:after="0" w:line="216" w:lineRule="auto"/>
+            </w:pPr>
+            <w:r>
+              <w:rPr>
+                <w:sz w:val="16"/>
+              </w:rPr>
+              <w:t>Heading 1</w:t>
+            </w:r>
+          </w:p>
+        </w:tc>
+        <w:tc>
+          <w:tcPr>
+            <w:tcW w:type="dxa" w:w="2600"/>
+            <w:vAlign w:val="center"/>
+          </w:tcPr>
+          <w:p>
+            <w:pPr>
+              <w:spacing w:after="0" w:line="216" w:lineRule="auto"/>
+            </w:pPr>
+            <w:r>
+              <w:rPr>
+                <w:sz w:val="16"/>
+              </w:rPr>
+              <w:t>Preserve heading 1 with a return path</w:t>
             </w:r>
           </w:p>
         </w:tc>
@@ -152,25 +636,72 @@
           <w:tcPr>
             <w:tcW w:type="dxa" w:w="3480"/>
             <w:vAlign w:val="center"/>
-            <w:shd w:fill="F2F4F7"/>
-            <w:tcMar>
-              <w:top w:w="80" w:type="dxa"/>
-              <w:start w:w="120" w:type="dxa"/>
-              <w:bottom w:w="80" w:type="dxa"/>
-              <w:end w:w="120" w:type="dxa"/>
-            </w:tcMar>
           </w:tcPr>
           <w:p>
             <w:pPr>
-              <w:spacing w:after="0"/>
+              <w:spacing w:after="0" w:line="216" w:lineRule="auto"/>
             </w:pPr>
             <w:r>
               <w:rPr>
-                <w:rFonts w:ascii="Calibri" w:hAnsi="Calibri"/>
-                <w:b/>
-                <w:sz w:val="20"/>
+                <w:sz w:val="16"/>
               </w:rPr>
-              <w:t>Reading value</w:t>
+              <w:t>If absent, disclose the heading 1 gap</w:t>
+            </w:r>
+          </w:p>
+        </w:tc>
+      </w:tr>
+      <w:tr>
+        <w:trPr>
+          <w:trHeight w:val="720" w:hRule="atLeast"/>
+        </w:trPr>
+        <w:tc>
+          <w:tcPr>
+            <w:tcW w:type="dxa" w:w="780"/>
+            <w:vAlign w:val="center"/>
+          </w:tcPr>
+          <w:p>
+            <w:pPr>
+              <w:spacing w:after="0" w:line="216" w:lineRule="auto"/>
+            </w:pPr>
+            <w:r>
+              <w:rPr>
+                <w:sz w:val="16"/>
+              </w:rPr>
+              <w:t>R-02</w:t>
+            </w:r>
+          </w:p>
+        </w:tc>
+        <w:tc>
+          <w:tcPr>
+            <w:tcW w:type="dxa" w:w="2100"/>
+            <w:vAlign w:val="center"/>
+          </w:tcPr>
+          <w:p>
+            <w:pPr>
+              <w:spacing w:after="0" w:line="216" w:lineRule="auto"/>
+            </w:pPr>
+            <w:r>
+              <w:rPr>
+                <w:sz w:val="16"/>
+              </w:rPr>
+              <w:t>Heading 2</w:t>
+            </w:r>
+          </w:p>
+        </w:tc>
+        <w:tc>
+          <w:tcPr>
+            <w:tcW w:type="dxa" w:w="2600"/>
+            <w:vAlign w:val="center"/>
+          </w:tcPr>
+          <w:p>
+            <w:pPr>
+              <w:spacing w:after="0" w:line="216" w:lineRule="auto"/>
+            </w:pPr>
+            <w:r>
+              <w:rPr>
+                <w:sz w:val="16"/>
+              </w:rPr>
+              <w:t>Preserve heading 2 with a return path</w:t>
             </w:r>
           </w:p>
         </w:tc>
@@ -178,52 +709,72 @@
           <w:tcPr>
             <w:tcW w:type="dxa" w:w="3480"/>
             <w:vAlign w:val="center"/>
-            <w:shd w:fill="F2F4F7"/>
-            <w:tcMar>
-              <w:top w:w="80" w:type="dxa"/>
-              <w:start w:w="120" w:type="dxa"/>
-              <w:bottom w:w="80" w:type="dxa"/>
-              <w:end w:w="120" w:type="dxa"/>
-            </w:tcMar>
           </w:tcPr>
           <w:p>
             <w:pPr>
-              <w:spacing w:after="0"/>
+              <w:spacing w:after="0" w:line="216" w:lineRule="auto"/>
             </w:pPr>
             <w:r>
               <w:rPr>
-                <w:rFonts w:ascii="Calibri" w:hAnsi="Calibri"/>
-                <w:b/>
-                <w:sz w:val="20"/>
+                <w:sz w:val="16"/>
               </w:rPr>
-              <w:t>Citation value</w:t>
+              <w:t>If absent, disclose the heading 2 gap</w:t>
             </w:r>
           </w:p>
         </w:tc>
       </w:tr>
       <w:tr>
+        <w:trPr>
+          <w:trHeight w:val="720" w:hRule="atLeast"/>
+        </w:trPr>
         <w:tc>
           <w:tcPr>
-            <w:tcW w:type="dxa" w:w="2400"/>
+            <w:tcW w:type="dxa" w:w="780"/>
             <w:vAlign w:val="center"/>
-            <w:tcMar>
-              <w:top w:w="80" w:type="dxa"/>
-              <w:start w:w="120" w:type="dxa"/>
-              <w:bottom w:w="80" w:type="dxa"/>
-              <w:end w:w="120" w:type="dxa"/>
-            </w:tcMar>
           </w:tcPr>
           <w:p>
             <w:pPr>
-              <w:spacing w:after="0"/>
+              <w:spacing w:after="0" w:line="216" w:lineRule="auto"/>
             </w:pPr>
             <w:r>
               <w:rPr>
-                <w:rFonts w:ascii="Calibri" w:hAnsi="Calibri"/>
-                <w:b w:val="0"/>
-                <w:sz w:val="20"/>
+                <w:sz w:val="16"/>
               </w:rPr>
-              <w:t>Plain text</w:t>
+              <w:t>R-03</w:t>
+            </w:r>
+          </w:p>
+        </w:tc>
+        <w:tc>
+          <w:tcPr>
+            <w:tcW w:type="dxa" w:w="2100"/>
+            <w:vAlign w:val="center"/>
+          </w:tcPr>
+          <w:p>
+            <w:pPr>
+              <w:spacing w:after="0" w:line="216" w:lineRule="auto"/>
+            </w:pPr>
+            <w:r>
+              <w:rPr>
+                <w:sz w:val="16"/>
+              </w:rPr>
+              <w:t>Heading 3</w:t>
+            </w:r>
+          </w:p>
+        </w:tc>
+        <w:tc>
+          <w:tcPr>
+            <w:tcW w:type="dxa" w:w="2600"/>
+            <w:vAlign w:val="center"/>
+          </w:tcPr>
+          <w:p>
+            <w:pPr>
+              <w:spacing w:after="0" w:line="216" w:lineRule="auto"/>
+            </w:pPr>
+            <w:r>
+              <w:rPr>
+                <w:sz w:val="16"/>
+              </w:rPr>
+              <w:t>Preserve heading 3 with a return path</w:t>
             </w:r>
           </w:p>
         </w:tc>
@@ -231,24 +782,72 @@
           <w:tcPr>
             <w:tcW w:type="dxa" w:w="3480"/>
             <w:vAlign w:val="center"/>
-            <w:tcMar>
-              <w:top w:w="80" w:type="dxa"/>
-              <w:start w:w="120" w:type="dxa"/>
-              <w:bottom w:w="80" w:type="dxa"/>
-              <w:end w:w="120" w:type="dxa"/>
-            </w:tcMar>
           </w:tcPr>
           <w:p>
             <w:pPr>
-              <w:spacing w:after="0"/>
+              <w:spacing w:after="0" w:line="216" w:lineRule="auto"/>
             </w:pPr>
             <w:r>
               <w:rPr>
-                <w:rFonts w:ascii="Calibri" w:hAnsi="Calibri"/>
-                <w:b w:val="0"/>
-                <w:sz w:val="20"/>
+                <w:sz w:val="16"/>
               </w:rPr>
-              <w:t>Partial</w:t>
+              <w:t>If absent, disclose the heading 3 gap</w:t>
+            </w:r>
+          </w:p>
+        </w:tc>
+      </w:tr>
+      <w:tr>
+        <w:trPr>
+          <w:trHeight w:val="720" w:hRule="atLeast"/>
+        </w:trPr>
+        <w:tc>
+          <w:tcPr>
+            <w:tcW w:type="dxa" w:w="780"/>
+            <w:vAlign w:val="center"/>
+          </w:tcPr>
+          <w:p>
+            <w:pPr>
+              <w:spacing w:after="0" w:line="216" w:lineRule="auto"/>
+            </w:pPr>
+            <w:r>
+              <w:rPr>
+                <w:sz w:val="16"/>
+              </w:rPr>
+              <w:t>R-04</w:t>
+            </w:r>
+          </w:p>
+        </w:tc>
+        <w:tc>
+          <w:tcPr>
+            <w:tcW w:type="dxa" w:w="2100"/>
+            <w:vAlign w:val="center"/>
+          </w:tcPr>
+          <w:p>
+            <w:pPr>
+              <w:spacing w:after="0" w:line="216" w:lineRule="auto"/>
+            </w:pPr>
+            <w:r>
+              <w:rPr>
+                <w:sz w:val="16"/>
+              </w:rPr>
+              <w:t>Numbered list</w:t>
+            </w:r>
+          </w:p>
+        </w:tc>
+        <w:tc>
+          <w:tcPr>
+            <w:tcW w:type="dxa" w:w="2600"/>
+            <w:vAlign w:val="center"/>
+          </w:tcPr>
+          <w:p>
+            <w:pPr>
+              <w:spacing w:after="0" w:line="216" w:lineRule="auto"/>
+            </w:pPr>
+            <w:r>
+              <w:rPr>
+                <w:sz w:val="16"/>
+              </w:rPr>
+              <w:t>Preserve numbered list with a return path</w:t>
             </w:r>
           </w:p>
         </w:tc>
@@ -256,51 +855,72 @@
           <w:tcPr>
             <w:tcW w:type="dxa" w:w="3480"/>
             <w:vAlign w:val="center"/>
-            <w:tcMar>
-              <w:top w:w="80" w:type="dxa"/>
-              <w:start w:w="120" w:type="dxa"/>
-              <w:bottom w:w="80" w:type="dxa"/>
-              <w:end w:w="120" w:type="dxa"/>
-            </w:tcMar>
           </w:tcPr>
           <w:p>
             <w:pPr>
-              <w:spacing w:after="0"/>
+              <w:spacing w:after="0" w:line="216" w:lineRule="auto"/>
             </w:pPr>
             <w:r>
               <w:rPr>
-                <w:rFonts w:ascii="Calibri" w:hAnsi="Calibri"/>
-                <w:b w:val="0"/>
-                <w:sz w:val="20"/>
+                <w:sz w:val="16"/>
               </w:rPr>
-              <w:t>Low</w:t>
+              <w:t>If absent, disclose the numbered list gap</w:t>
             </w:r>
           </w:p>
         </w:tc>
       </w:tr>
       <w:tr>
+        <w:trPr>
+          <w:trHeight w:val="720" w:hRule="atLeast"/>
+        </w:trPr>
         <w:tc>
           <w:tcPr>
-            <w:tcW w:type="dxa" w:w="2400"/>
+            <w:tcW w:type="dxa" w:w="780"/>
             <w:vAlign w:val="center"/>
-            <w:tcMar>
-              <w:top w:w="80" w:type="dxa"/>
-              <w:start w:w="120" w:type="dxa"/>
-              <w:bottom w:w="80" w:type="dxa"/>
-              <w:end w:w="120" w:type="dxa"/>
-            </w:tcMar>
           </w:tcPr>
           <w:p>
             <w:pPr>
-              <w:spacing w:after="0"/>
+              <w:spacing w:after="0" w:line="216" w:lineRule="auto"/>
             </w:pPr>
             <w:r>
               <w:rPr>
-                <w:rFonts w:ascii="Calibri" w:hAnsi="Calibri"/>
-                <w:b w:val="0"/>
-                <w:sz w:val="20"/>
+                <w:sz w:val="16"/>
               </w:rPr>
-              <w:t>Structure aware</w:t>
+              <w:t>R-05</w:t>
+            </w:r>
+          </w:p>
+        </w:tc>
+        <w:tc>
+          <w:tcPr>
+            <w:tcW w:type="dxa" w:w="2100"/>
+            <w:vAlign w:val="center"/>
+          </w:tcPr>
+          <w:p>
+            <w:pPr>
+              <w:spacing w:after="0" w:line="216" w:lineRule="auto"/>
+            </w:pPr>
+            <w:r>
+              <w:rPr>
+                <w:sz w:val="16"/>
+              </w:rPr>
+              <w:t>Nested list</w:t>
+            </w:r>
+          </w:p>
+        </w:tc>
+        <w:tc>
+          <w:tcPr>
+            <w:tcW w:type="dxa" w:w="2600"/>
+            <w:vAlign w:val="center"/>
+          </w:tcPr>
+          <w:p>
+            <w:pPr>
+              <w:spacing w:after="0" w:line="216" w:lineRule="auto"/>
+            </w:pPr>
+            <w:r>
+              <w:rPr>
+                <w:sz w:val="16"/>
+              </w:rPr>
+              <w:t>Preserve nested list with a return path</w:t>
             </w:r>
           </w:p>
         </w:tc>
@@ -308,24 +928,72 @@
           <w:tcPr>
             <w:tcW w:type="dxa" w:w="3480"/>
             <w:vAlign w:val="center"/>
-            <w:tcMar>
-              <w:top w:w="80" w:type="dxa"/>
-              <w:start w:w="120" w:type="dxa"/>
-              <w:bottom w:w="80" w:type="dxa"/>
-              <w:end w:w="120" w:type="dxa"/>
-            </w:tcMar>
           </w:tcPr>
           <w:p>
             <w:pPr>
-              <w:spacing w:after="0"/>
+              <w:spacing w:after="0" w:line="216" w:lineRule="auto"/>
             </w:pPr>
             <w:r>
               <w:rPr>
-                <w:rFonts w:ascii="Calibri" w:hAnsi="Calibri"/>
-                <w:b w:val="0"/>
-                <w:sz w:val="20"/>
+                <w:sz w:val="16"/>
               </w:rPr>
-              <w:t>High</w:t>
+              <w:t>If absent, disclose the nested list gap</w:t>
+            </w:r>
+          </w:p>
+        </w:tc>
+      </w:tr>
+      <w:tr>
+        <w:trPr>
+          <w:trHeight w:val="720" w:hRule="atLeast"/>
+        </w:trPr>
+        <w:tc>
+          <w:tcPr>
+            <w:tcW w:type="dxa" w:w="780"/>
+            <w:vAlign w:val="center"/>
+          </w:tcPr>
+          <w:p>
+            <w:pPr>
+              <w:spacing w:after="0" w:line="216" w:lineRule="auto"/>
+            </w:pPr>
+            <w:r>
+              <w:rPr>
+                <w:sz w:val="16"/>
+              </w:rPr>
+              <w:t>R-06</w:t>
+            </w:r>
+          </w:p>
+        </w:tc>
+        <w:tc>
+          <w:tcPr>
+            <w:tcW w:type="dxa" w:w="2100"/>
+            <w:vAlign w:val="center"/>
+          </w:tcPr>
+          <w:p>
+            <w:pPr>
+              <w:spacing w:after="0" w:line="216" w:lineRule="auto"/>
+            </w:pPr>
+            <w:r>
+              <w:rPr>
+                <w:sz w:val="16"/>
+              </w:rPr>
+              <w:t>Merged cells</w:t>
+            </w:r>
+          </w:p>
+        </w:tc>
+        <w:tc>
+          <w:tcPr>
+            <w:tcW w:type="dxa" w:w="2600"/>
+            <w:vAlign w:val="center"/>
+          </w:tcPr>
+          <w:p>
+            <w:pPr>
+              <w:spacing w:after="0" w:line="216" w:lineRule="auto"/>
+            </w:pPr>
+            <w:r>
+              <w:rPr>
+                <w:sz w:val="16"/>
+              </w:rPr>
+              <w:t>Preserve merged cells with a return path</w:t>
             </w:r>
           </w:p>
         </w:tc>
@@ -333,51 +1001,72 @@
           <w:tcPr>
             <w:tcW w:type="dxa" w:w="3480"/>
             <w:vAlign w:val="center"/>
-            <w:tcMar>
-              <w:top w:w="80" w:type="dxa"/>
-              <w:start w:w="120" w:type="dxa"/>
-              <w:bottom w:w="80" w:type="dxa"/>
-              <w:end w:w="120" w:type="dxa"/>
-            </w:tcMar>
           </w:tcPr>
           <w:p>
             <w:pPr>
-              <w:spacing w:after="0"/>
+              <w:spacing w:after="0" w:line="216" w:lineRule="auto"/>
             </w:pPr>
             <w:r>
               <w:rPr>
-                <w:rFonts w:ascii="Calibri" w:hAnsi="Calibri"/>
-                <w:b w:val="0"/>
-                <w:sz w:val="20"/>
+                <w:sz w:val="16"/>
               </w:rPr>
-              <w:t>High</w:t>
+              <w:t>If absent, disclose the merged cells gap</w:t>
             </w:r>
           </w:p>
         </w:tc>
       </w:tr>
       <w:tr>
+        <w:trPr>
+          <w:trHeight w:val="720" w:hRule="atLeast"/>
+        </w:trPr>
         <w:tc>
           <w:tcPr>
-            <w:tcW w:type="dxa" w:w="2400"/>
+            <w:tcW w:type="dxa" w:w="780"/>
             <w:vAlign w:val="center"/>
-            <w:tcMar>
-              <w:top w:w="80" w:type="dxa"/>
-              <w:start w:w="120" w:type="dxa"/>
-              <w:bottom w:w="80" w:type="dxa"/>
-              <w:end w:w="120" w:type="dxa"/>
-            </w:tcMar>
           </w:tcPr>
           <w:p>
             <w:pPr>
-              <w:spacing w:after="0"/>
+              <w:spacing w:after="0" w:line="216" w:lineRule="auto"/>
             </w:pPr>
             <w:r>
               <w:rPr>
-                <w:rFonts w:ascii="Calibri" w:hAnsi="Calibri"/>
-                <w:b w:val="0"/>
-                <w:sz w:val="20"/>
+                <w:sz w:val="16"/>
               </w:rPr>
-              <w:t>Silent fallback</w:t>
+              <w:t>R-07</w:t>
+            </w:r>
+          </w:p>
+        </w:tc>
+        <w:tc>
+          <w:tcPr>
+            <w:tcW w:type="dxa" w:w="2100"/>
+            <w:vAlign w:val="center"/>
+          </w:tcPr>
+          <w:p>
+            <w:pPr>
+              <w:spacing w:after="0" w:line="216" w:lineRule="auto"/>
+            </w:pPr>
+            <w:r>
+              <w:rPr>
+                <w:sz w:val="16"/>
+              </w:rPr>
+              <w:t>Table header</w:t>
+            </w:r>
+          </w:p>
+        </w:tc>
+        <w:tc>
+          <w:tcPr>
+            <w:tcW w:type="dxa" w:w="2600"/>
+            <w:vAlign w:val="center"/>
+          </w:tcPr>
+          <w:p>
+            <w:pPr>
+              <w:spacing w:after="0" w:line="216" w:lineRule="auto"/>
+            </w:pPr>
+            <w:r>
+              <w:rPr>
+                <w:sz w:val="16"/>
+              </w:rPr>
+              <w:t>Preserve table header with a return path</w:t>
             </w:r>
           </w:p>
         </w:tc>
@@ -385,24 +1074,72 @@
           <w:tcPr>
             <w:tcW w:type="dxa" w:w="3480"/>
             <w:vAlign w:val="center"/>
-            <w:tcMar>
-              <w:top w:w="80" w:type="dxa"/>
-              <w:start w:w="120" w:type="dxa"/>
-              <w:bottom w:w="80" w:type="dxa"/>
-              <w:end w:w="120" w:type="dxa"/>
-            </w:tcMar>
           </w:tcPr>
           <w:p>
             <w:pPr>
-              <w:spacing w:after="0"/>
+              <w:spacing w:after="0" w:line="216" w:lineRule="auto"/>
             </w:pPr>
             <w:r>
               <w:rPr>
-                <w:rFonts w:ascii="Calibri" w:hAnsi="Calibri"/>
-                <w:b w:val="0"/>
-                <w:sz w:val="20"/>
+                <w:sz w:val="16"/>
               </w:rPr>
-              <w:t>Misleading</w:t>
+              <w:t>If absent, disclose the table header gap</w:t>
+            </w:r>
+          </w:p>
+        </w:tc>
+      </w:tr>
+      <w:tr>
+        <w:trPr>
+          <w:trHeight w:val="720" w:hRule="atLeast"/>
+        </w:trPr>
+        <w:tc>
+          <w:tcPr>
+            <w:tcW w:type="dxa" w:w="780"/>
+            <w:vAlign w:val="center"/>
+          </w:tcPr>
+          <w:p>
+            <w:pPr>
+              <w:spacing w:after="0" w:line="216" w:lineRule="auto"/>
+            </w:pPr>
+            <w:r>
+              <w:rPr>
+                <w:sz w:val="16"/>
+              </w:rPr>
+              <w:t>R-08</w:t>
+            </w:r>
+          </w:p>
+        </w:tc>
+        <w:tc>
+          <w:tcPr>
+            <w:tcW w:type="dxa" w:w="2100"/>
+            <w:vAlign w:val="center"/>
+          </w:tcPr>
+          <w:p>
+            <w:pPr>
+              <w:spacing w:after="0" w:line="216" w:lineRule="auto"/>
+            </w:pPr>
+            <w:r>
+              <w:rPr>
+                <w:sz w:val="16"/>
+              </w:rPr>
+              <w:t>Table continuation</w:t>
+            </w:r>
+          </w:p>
+        </w:tc>
+        <w:tc>
+          <w:tcPr>
+            <w:tcW w:type="dxa" w:w="2600"/>
+            <w:vAlign w:val="center"/>
+          </w:tcPr>
+          <w:p>
+            <w:pPr>
+              <w:spacing w:after="0" w:line="216" w:lineRule="auto"/>
+            </w:pPr>
+            <w:r>
+              <w:rPr>
+                <w:sz w:val="16"/>
+              </w:rPr>
+              <w:t>Preserve table continuation with a return path</w:t>
             </w:r>
           </w:p>
         </w:tc>
@@ -410,24 +1147,1768 @@
           <w:tcPr>
             <w:tcW w:type="dxa" w:w="3480"/>
             <w:vAlign w:val="center"/>
-            <w:tcMar>
-              <w:top w:w="80" w:type="dxa"/>
-              <w:start w:w="120" w:type="dxa"/>
-              <w:bottom w:w="80" w:type="dxa"/>
-              <w:end w:w="120" w:type="dxa"/>
-            </w:tcMar>
           </w:tcPr>
           <w:p>
             <w:pPr>
-              <w:spacing w:after="0"/>
+              <w:spacing w:after="0" w:line="216" w:lineRule="auto"/>
             </w:pPr>
             <w:r>
               <w:rPr>
-                <w:rFonts w:ascii="Calibri" w:hAnsi="Calibri"/>
-                <w:b w:val="0"/>
-                <w:sz w:val="20"/>
+                <w:sz w:val="16"/>
               </w:rPr>
-              <w:t>Unacceptable</w:t>
+              <w:t>If absent, disclose the table continuation gap</w:t>
+            </w:r>
+          </w:p>
+        </w:tc>
+      </w:tr>
+      <w:tr>
+        <w:trPr>
+          <w:trHeight w:val="720" w:hRule="atLeast"/>
+        </w:trPr>
+        <w:tc>
+          <w:tcPr>
+            <w:tcW w:type="dxa" w:w="780"/>
+            <w:vAlign w:val="center"/>
+          </w:tcPr>
+          <w:p>
+            <w:pPr>
+              <w:spacing w:after="0" w:line="216" w:lineRule="auto"/>
+            </w:pPr>
+            <w:r>
+              <w:rPr>
+                <w:sz w:val="16"/>
+              </w:rPr>
+              <w:t>R-09</w:t>
+            </w:r>
+          </w:p>
+        </w:tc>
+        <w:tc>
+          <w:tcPr>
+            <w:tcW w:type="dxa" w:w="2100"/>
+            <w:vAlign w:val="center"/>
+          </w:tcPr>
+          <w:p>
+            <w:pPr>
+              <w:spacing w:after="0" w:line="216" w:lineRule="auto"/>
+            </w:pPr>
+            <w:r>
+              <w:rPr>
+                <w:sz w:val="16"/>
+              </w:rPr>
+              <w:t>Inline image</w:t>
+            </w:r>
+          </w:p>
+        </w:tc>
+        <w:tc>
+          <w:tcPr>
+            <w:tcW w:type="dxa" w:w="2600"/>
+            <w:vAlign w:val="center"/>
+          </w:tcPr>
+          <w:p>
+            <w:pPr>
+              <w:spacing w:after="0" w:line="216" w:lineRule="auto"/>
+            </w:pPr>
+            <w:r>
+              <w:rPr>
+                <w:sz w:val="16"/>
+              </w:rPr>
+              <w:t>Preserve inline image with a return path</w:t>
+            </w:r>
+          </w:p>
+        </w:tc>
+        <w:tc>
+          <w:tcPr>
+            <w:tcW w:type="dxa" w:w="3480"/>
+            <w:vAlign w:val="center"/>
+          </w:tcPr>
+          <w:p>
+            <w:pPr>
+              <w:spacing w:after="0" w:line="216" w:lineRule="auto"/>
+            </w:pPr>
+            <w:r>
+              <w:rPr>
+                <w:sz w:val="16"/>
+              </w:rPr>
+              <w:t>If absent, disclose the inline image gap</w:t>
+            </w:r>
+          </w:p>
+        </w:tc>
+      </w:tr>
+      <w:tr>
+        <w:trPr>
+          <w:trHeight w:val="720" w:hRule="atLeast"/>
+        </w:trPr>
+        <w:tc>
+          <w:tcPr>
+            <w:tcW w:type="dxa" w:w="780"/>
+            <w:vAlign w:val="center"/>
+          </w:tcPr>
+          <w:p>
+            <w:pPr>
+              <w:spacing w:after="0" w:line="216" w:lineRule="auto"/>
+            </w:pPr>
+            <w:r>
+              <w:rPr>
+                <w:sz w:val="16"/>
+              </w:rPr>
+              <w:t>R-10</w:t>
+            </w:r>
+          </w:p>
+        </w:tc>
+        <w:tc>
+          <w:tcPr>
+            <w:tcW w:type="dxa" w:w="2100"/>
+            <w:vAlign w:val="center"/>
+          </w:tcPr>
+          <w:p>
+            <w:pPr>
+              <w:spacing w:after="0" w:line="216" w:lineRule="auto"/>
+            </w:pPr>
+            <w:r>
+              <w:rPr>
+                <w:sz w:val="16"/>
+              </w:rPr>
+              <w:t>Caption</w:t>
+            </w:r>
+          </w:p>
+        </w:tc>
+        <w:tc>
+          <w:tcPr>
+            <w:tcW w:type="dxa" w:w="2600"/>
+            <w:vAlign w:val="center"/>
+          </w:tcPr>
+          <w:p>
+            <w:pPr>
+              <w:spacing w:after="0" w:line="216" w:lineRule="auto"/>
+            </w:pPr>
+            <w:r>
+              <w:rPr>
+                <w:sz w:val="16"/>
+              </w:rPr>
+              <w:t>Preserve caption with a return path</w:t>
+            </w:r>
+          </w:p>
+        </w:tc>
+        <w:tc>
+          <w:tcPr>
+            <w:tcW w:type="dxa" w:w="3480"/>
+            <w:vAlign w:val="center"/>
+          </w:tcPr>
+          <w:p>
+            <w:pPr>
+              <w:spacing w:after="0" w:line="216" w:lineRule="auto"/>
+            </w:pPr>
+            <w:r>
+              <w:rPr>
+                <w:sz w:val="16"/>
+              </w:rPr>
+              <w:t>If absent, disclose the caption gap</w:t>
+            </w:r>
+          </w:p>
+        </w:tc>
+      </w:tr>
+      <w:tr>
+        <w:trPr>
+          <w:trHeight w:val="720" w:hRule="atLeast"/>
+        </w:trPr>
+        <w:tc>
+          <w:tcPr>
+            <w:tcW w:type="dxa" w:w="780"/>
+            <w:vAlign w:val="center"/>
+          </w:tcPr>
+          <w:p>
+            <w:pPr>
+              <w:spacing w:after="0" w:line="216" w:lineRule="auto"/>
+            </w:pPr>
+            <w:r>
+              <w:rPr>
+                <w:sz w:val="16"/>
+              </w:rPr>
+              <w:t>R-11</w:t>
+            </w:r>
+          </w:p>
+        </w:tc>
+        <w:tc>
+          <w:tcPr>
+            <w:tcW w:type="dxa" w:w="2100"/>
+            <w:vAlign w:val="center"/>
+          </w:tcPr>
+          <w:p>
+            <w:pPr>
+              <w:spacing w:after="0" w:line="216" w:lineRule="auto"/>
+            </w:pPr>
+            <w:r>
+              <w:rPr>
+                <w:sz w:val="16"/>
+              </w:rPr>
+              <w:t>Footnote</w:t>
+            </w:r>
+          </w:p>
+        </w:tc>
+        <w:tc>
+          <w:tcPr>
+            <w:tcW w:type="dxa" w:w="2600"/>
+            <w:vAlign w:val="center"/>
+          </w:tcPr>
+          <w:p>
+            <w:pPr>
+              <w:spacing w:after="0" w:line="216" w:lineRule="auto"/>
+            </w:pPr>
+            <w:r>
+              <w:rPr>
+                <w:sz w:val="16"/>
+              </w:rPr>
+              <w:t>Preserve footnote with a return path</w:t>
+            </w:r>
+          </w:p>
+        </w:tc>
+        <w:tc>
+          <w:tcPr>
+            <w:tcW w:type="dxa" w:w="3480"/>
+            <w:vAlign w:val="center"/>
+          </w:tcPr>
+          <w:p>
+            <w:pPr>
+              <w:spacing w:after="0" w:line="216" w:lineRule="auto"/>
+            </w:pPr>
+            <w:r>
+              <w:rPr>
+                <w:sz w:val="16"/>
+              </w:rPr>
+              <w:t>If absent, disclose the footnote gap</w:t>
+            </w:r>
+          </w:p>
+        </w:tc>
+      </w:tr>
+      <w:tr>
+        <w:trPr>
+          <w:trHeight w:val="720" w:hRule="atLeast"/>
+        </w:trPr>
+        <w:tc>
+          <w:tcPr>
+            <w:tcW w:type="dxa" w:w="780"/>
+            <w:vAlign w:val="center"/>
+          </w:tcPr>
+          <w:p>
+            <w:pPr>
+              <w:spacing w:after="0" w:line="216" w:lineRule="auto"/>
+            </w:pPr>
+            <w:r>
+              <w:rPr>
+                <w:sz w:val="16"/>
+              </w:rPr>
+              <w:t>R-12</w:t>
+            </w:r>
+          </w:p>
+        </w:tc>
+        <w:tc>
+          <w:tcPr>
+            <w:tcW w:type="dxa" w:w="2100"/>
+            <w:vAlign w:val="center"/>
+          </w:tcPr>
+          <w:p>
+            <w:pPr>
+              <w:spacing w:after="0" w:line="216" w:lineRule="auto"/>
+            </w:pPr>
+            <w:r>
+              <w:rPr>
+                <w:sz w:val="16"/>
+              </w:rPr>
+              <w:t>Page field</w:t>
+            </w:r>
+          </w:p>
+        </w:tc>
+        <w:tc>
+          <w:tcPr>
+            <w:tcW w:type="dxa" w:w="2600"/>
+            <w:vAlign w:val="center"/>
+          </w:tcPr>
+          <w:p>
+            <w:pPr>
+              <w:spacing w:after="0" w:line="216" w:lineRule="auto"/>
+            </w:pPr>
+            <w:r>
+              <w:rPr>
+                <w:sz w:val="16"/>
+              </w:rPr>
+              <w:t>Preserve page field with a return path</w:t>
+            </w:r>
+          </w:p>
+        </w:tc>
+        <w:tc>
+          <w:tcPr>
+            <w:tcW w:type="dxa" w:w="3480"/>
+            <w:vAlign w:val="center"/>
+          </w:tcPr>
+          <w:p>
+            <w:pPr>
+              <w:spacing w:after="0" w:line="216" w:lineRule="auto"/>
+            </w:pPr>
+            <w:r>
+              <w:rPr>
+                <w:sz w:val="16"/>
+              </w:rPr>
+              <w:t>If absent, disclose the page field gap</w:t>
+            </w:r>
+          </w:p>
+        </w:tc>
+      </w:tr>
+      <w:tr>
+        <w:trPr>
+          <w:trHeight w:val="720" w:hRule="atLeast"/>
+        </w:trPr>
+        <w:tc>
+          <w:tcPr>
+            <w:tcW w:type="dxa" w:w="780"/>
+            <w:vAlign w:val="center"/>
+          </w:tcPr>
+          <w:p>
+            <w:pPr>
+              <w:spacing w:after="0" w:line="216" w:lineRule="auto"/>
+            </w:pPr>
+            <w:r>
+              <w:rPr>
+                <w:sz w:val="16"/>
+              </w:rPr>
+              <w:t>R-13</w:t>
+            </w:r>
+          </w:p>
+        </w:tc>
+        <w:tc>
+          <w:tcPr>
+            <w:tcW w:type="dxa" w:w="2100"/>
+            <w:vAlign w:val="center"/>
+          </w:tcPr>
+          <w:p>
+            <w:pPr>
+              <w:spacing w:after="0" w:line="216" w:lineRule="auto"/>
+            </w:pPr>
+            <w:r>
+              <w:rPr>
+                <w:sz w:val="16"/>
+              </w:rPr>
+              <w:t>Header</w:t>
+            </w:r>
+          </w:p>
+        </w:tc>
+        <w:tc>
+          <w:tcPr>
+            <w:tcW w:type="dxa" w:w="2600"/>
+            <w:vAlign w:val="center"/>
+          </w:tcPr>
+          <w:p>
+            <w:pPr>
+              <w:spacing w:after="0" w:line="216" w:lineRule="auto"/>
+            </w:pPr>
+            <w:r>
+              <w:rPr>
+                <w:sz w:val="16"/>
+              </w:rPr>
+              <w:t>Preserve header with a return path</w:t>
+            </w:r>
+          </w:p>
+        </w:tc>
+        <w:tc>
+          <w:tcPr>
+            <w:tcW w:type="dxa" w:w="3480"/>
+            <w:vAlign w:val="center"/>
+          </w:tcPr>
+          <w:p>
+            <w:pPr>
+              <w:spacing w:after="0" w:line="216" w:lineRule="auto"/>
+            </w:pPr>
+            <w:r>
+              <w:rPr>
+                <w:sz w:val="16"/>
+              </w:rPr>
+              <w:t>If absent, disclose the header gap</w:t>
+            </w:r>
+          </w:p>
+        </w:tc>
+      </w:tr>
+      <w:tr>
+        <w:trPr>
+          <w:trHeight w:val="720" w:hRule="atLeast"/>
+        </w:trPr>
+        <w:tc>
+          <w:tcPr>
+            <w:tcW w:type="dxa" w:w="780"/>
+            <w:vAlign w:val="center"/>
+          </w:tcPr>
+          <w:p>
+            <w:pPr>
+              <w:spacing w:after="0" w:line="216" w:lineRule="auto"/>
+            </w:pPr>
+            <w:r>
+              <w:rPr>
+                <w:sz w:val="16"/>
+              </w:rPr>
+              <w:t>R-14</w:t>
+            </w:r>
+          </w:p>
+        </w:tc>
+        <w:tc>
+          <w:tcPr>
+            <w:tcW w:type="dxa" w:w="2100"/>
+            <w:vAlign w:val="center"/>
+          </w:tcPr>
+          <w:p>
+            <w:pPr>
+              <w:spacing w:after="0" w:line="216" w:lineRule="auto"/>
+            </w:pPr>
+            <w:r>
+              <w:rPr>
+                <w:sz w:val="16"/>
+              </w:rPr>
+              <w:t>Footer</w:t>
+            </w:r>
+          </w:p>
+        </w:tc>
+        <w:tc>
+          <w:tcPr>
+            <w:tcW w:type="dxa" w:w="2600"/>
+            <w:vAlign w:val="center"/>
+          </w:tcPr>
+          <w:p>
+            <w:pPr>
+              <w:spacing w:after="0" w:line="216" w:lineRule="auto"/>
+            </w:pPr>
+            <w:r>
+              <w:rPr>
+                <w:sz w:val="16"/>
+              </w:rPr>
+              <w:t>Preserve footer with a return path</w:t>
+            </w:r>
+          </w:p>
+        </w:tc>
+        <w:tc>
+          <w:tcPr>
+            <w:tcW w:type="dxa" w:w="3480"/>
+            <w:vAlign w:val="center"/>
+          </w:tcPr>
+          <w:p>
+            <w:pPr>
+              <w:spacing w:after="0" w:line="216" w:lineRule="auto"/>
+            </w:pPr>
+            <w:r>
+              <w:rPr>
+                <w:sz w:val="16"/>
+              </w:rPr>
+              <w:t>If absent, disclose the footer gap</w:t>
+            </w:r>
+          </w:p>
+        </w:tc>
+      </w:tr>
+      <w:tr>
+        <w:trPr>
+          <w:trHeight w:val="720" w:hRule="atLeast"/>
+        </w:trPr>
+        <w:tc>
+          <w:tcPr>
+            <w:tcW w:type="dxa" w:w="780"/>
+            <w:vAlign w:val="center"/>
+          </w:tcPr>
+          <w:p>
+            <w:pPr>
+              <w:spacing w:after="0" w:line="216" w:lineRule="auto"/>
+            </w:pPr>
+            <w:r>
+              <w:rPr>
+                <w:sz w:val="16"/>
+              </w:rPr>
+              <w:t>R-15</w:t>
+            </w:r>
+          </w:p>
+        </w:tc>
+        <w:tc>
+          <w:tcPr>
+            <w:tcW w:type="dxa" w:w="2100"/>
+            <w:vAlign w:val="center"/>
+          </w:tcPr>
+          <w:p>
+            <w:pPr>
+              <w:spacing w:after="0" w:line="216" w:lineRule="auto"/>
+            </w:pPr>
+            <w:r>
+              <w:rPr>
+                <w:sz w:val="16"/>
+              </w:rPr>
+              <w:t>Source list</w:t>
+            </w:r>
+          </w:p>
+        </w:tc>
+        <w:tc>
+          <w:tcPr>
+            <w:tcW w:type="dxa" w:w="2600"/>
+            <w:vAlign w:val="center"/>
+          </w:tcPr>
+          <w:p>
+            <w:pPr>
+              <w:spacing w:after="0" w:line="216" w:lineRule="auto"/>
+            </w:pPr>
+            <w:r>
+              <w:rPr>
+                <w:sz w:val="16"/>
+              </w:rPr>
+              <w:t>Preserve source list with a return path</w:t>
+            </w:r>
+          </w:p>
+        </w:tc>
+        <w:tc>
+          <w:tcPr>
+            <w:tcW w:type="dxa" w:w="3480"/>
+            <w:vAlign w:val="center"/>
+          </w:tcPr>
+          <w:p>
+            <w:pPr>
+              <w:spacing w:after="0" w:line="216" w:lineRule="auto"/>
+            </w:pPr>
+            <w:r>
+              <w:rPr>
+                <w:sz w:val="16"/>
+              </w:rPr>
+              <w:t>If absent, disclose the source list gap</w:t>
+            </w:r>
+          </w:p>
+        </w:tc>
+      </w:tr>
+      <w:tr>
+        <w:trPr>
+          <w:trHeight w:val="720" w:hRule="atLeast"/>
+        </w:trPr>
+        <w:tc>
+          <w:tcPr>
+            <w:tcW w:type="dxa" w:w="780"/>
+            <w:vAlign w:val="center"/>
+          </w:tcPr>
+          <w:p>
+            <w:pPr>
+              <w:spacing w:after="0" w:line="216" w:lineRule="auto"/>
+            </w:pPr>
+            <w:r>
+              <w:rPr>
+                <w:sz w:val="16"/>
+              </w:rPr>
+              <w:t>R-16</w:t>
+            </w:r>
+          </w:p>
+        </w:tc>
+        <w:tc>
+          <w:tcPr>
+            <w:tcW w:type="dxa" w:w="2100"/>
+            <w:vAlign w:val="center"/>
+          </w:tcPr>
+          <w:p>
+            <w:pPr>
+              <w:spacing w:after="0" w:line="216" w:lineRule="auto"/>
+            </w:pPr>
+            <w:r>
+              <w:rPr>
+                <w:sz w:val="16"/>
+              </w:rPr>
+              <w:t>Reference entry</w:t>
+            </w:r>
+          </w:p>
+        </w:tc>
+        <w:tc>
+          <w:tcPr>
+            <w:tcW w:type="dxa" w:w="2600"/>
+            <w:vAlign w:val="center"/>
+          </w:tcPr>
+          <w:p>
+            <w:pPr>
+              <w:spacing w:after="0" w:line="216" w:lineRule="auto"/>
+            </w:pPr>
+            <w:r>
+              <w:rPr>
+                <w:sz w:val="16"/>
+              </w:rPr>
+              <w:t>Preserve reference entry with a return path</w:t>
+            </w:r>
+          </w:p>
+        </w:tc>
+        <w:tc>
+          <w:tcPr>
+            <w:tcW w:type="dxa" w:w="3480"/>
+            <w:vAlign w:val="center"/>
+          </w:tcPr>
+          <w:p>
+            <w:pPr>
+              <w:spacing w:after="0" w:line="216" w:lineRule="auto"/>
+            </w:pPr>
+            <w:r>
+              <w:rPr>
+                <w:sz w:val="16"/>
+              </w:rPr>
+              <w:t>If absent, disclose the reference entry gap</w:t>
+            </w:r>
+          </w:p>
+        </w:tc>
+      </w:tr>
+      <w:tr>
+        <w:trPr>
+          <w:trHeight w:val="720" w:hRule="atLeast"/>
+        </w:trPr>
+        <w:tc>
+          <w:tcPr>
+            <w:tcW w:type="dxa" w:w="780"/>
+            <w:vAlign w:val="center"/>
+          </w:tcPr>
+          <w:p>
+            <w:pPr>
+              <w:spacing w:after="0" w:line="216" w:lineRule="auto"/>
+            </w:pPr>
+            <w:r>
+              <w:rPr>
+                <w:sz w:val="16"/>
+              </w:rPr>
+              <w:t>R-17</w:t>
+            </w:r>
+          </w:p>
+        </w:tc>
+        <w:tc>
+          <w:tcPr>
+            <w:tcW w:type="dxa" w:w="2100"/>
+            <w:vAlign w:val="center"/>
+          </w:tcPr>
+          <w:p>
+            <w:pPr>
+              <w:spacing w:after="0" w:line="216" w:lineRule="auto"/>
+            </w:pPr>
+            <w:r>
+              <w:rPr>
+                <w:sz w:val="16"/>
+              </w:rPr>
+              <w:t>Executive paragraph</w:t>
+            </w:r>
+          </w:p>
+        </w:tc>
+        <w:tc>
+          <w:tcPr>
+            <w:tcW w:type="dxa" w:w="2600"/>
+            <w:vAlign w:val="center"/>
+          </w:tcPr>
+          <w:p>
+            <w:pPr>
+              <w:spacing w:after="0" w:line="216" w:lineRule="auto"/>
+            </w:pPr>
+            <w:r>
+              <w:rPr>
+                <w:sz w:val="16"/>
+              </w:rPr>
+              <w:t>Preserve executive paragraph with a return path</w:t>
+            </w:r>
+          </w:p>
+        </w:tc>
+        <w:tc>
+          <w:tcPr>
+            <w:tcW w:type="dxa" w:w="3480"/>
+            <w:vAlign w:val="center"/>
+          </w:tcPr>
+          <w:p>
+            <w:pPr>
+              <w:spacing w:after="0" w:line="216" w:lineRule="auto"/>
+            </w:pPr>
+            <w:r>
+              <w:rPr>
+                <w:sz w:val="16"/>
+              </w:rPr>
+              <w:t>If absent, disclose the executive paragraph gap</w:t>
+            </w:r>
+          </w:p>
+        </w:tc>
+      </w:tr>
+      <w:tr>
+        <w:trPr>
+          <w:trHeight w:val="720" w:hRule="atLeast"/>
+        </w:trPr>
+        <w:tc>
+          <w:tcPr>
+            <w:tcW w:type="dxa" w:w="780"/>
+            <w:vAlign w:val="center"/>
+          </w:tcPr>
+          <w:p>
+            <w:pPr>
+              <w:spacing w:after="0" w:line="216" w:lineRule="auto"/>
+            </w:pPr>
+            <w:r>
+              <w:rPr>
+                <w:sz w:val="16"/>
+              </w:rPr>
+              <w:t>R-18</w:t>
+            </w:r>
+          </w:p>
+        </w:tc>
+        <w:tc>
+          <w:tcPr>
+            <w:tcW w:type="dxa" w:w="2100"/>
+            <w:vAlign w:val="center"/>
+          </w:tcPr>
+          <w:p>
+            <w:pPr>
+              <w:spacing w:after="0" w:line="216" w:lineRule="auto"/>
+            </w:pPr>
+            <w:r>
+              <w:rPr>
+                <w:sz w:val="16"/>
+              </w:rPr>
+              <w:t>Decision criterion</w:t>
+            </w:r>
+          </w:p>
+        </w:tc>
+        <w:tc>
+          <w:tcPr>
+            <w:tcW w:type="dxa" w:w="2600"/>
+            <w:vAlign w:val="center"/>
+          </w:tcPr>
+          <w:p>
+            <w:pPr>
+              <w:spacing w:after="0" w:line="216" w:lineRule="auto"/>
+            </w:pPr>
+            <w:r>
+              <w:rPr>
+                <w:sz w:val="16"/>
+              </w:rPr>
+              <w:t>Preserve decision criterion with a return path</w:t>
+            </w:r>
+          </w:p>
+        </w:tc>
+        <w:tc>
+          <w:tcPr>
+            <w:tcW w:type="dxa" w:w="3480"/>
+            <w:vAlign w:val="center"/>
+          </w:tcPr>
+          <w:p>
+            <w:pPr>
+              <w:spacing w:after="0" w:line="216" w:lineRule="auto"/>
+            </w:pPr>
+            <w:r>
+              <w:rPr>
+                <w:sz w:val="16"/>
+              </w:rPr>
+              <w:t>If absent, disclose the decision criterion gap</w:t>
+            </w:r>
+          </w:p>
+        </w:tc>
+      </w:tr>
+      <w:tr>
+        <w:trPr>
+          <w:trHeight w:val="720" w:hRule="atLeast"/>
+        </w:trPr>
+        <w:tc>
+          <w:tcPr>
+            <w:tcW w:type="dxa" w:w="780"/>
+            <w:vAlign w:val="center"/>
+          </w:tcPr>
+          <w:p>
+            <w:pPr>
+              <w:spacing w:after="0" w:line="216" w:lineRule="auto"/>
+            </w:pPr>
+            <w:r>
+              <w:rPr>
+                <w:sz w:val="16"/>
+              </w:rPr>
+              <w:t>R-19</w:t>
+            </w:r>
+          </w:p>
+        </w:tc>
+        <w:tc>
+          <w:tcPr>
+            <w:tcW w:type="dxa" w:w="2100"/>
+            <w:vAlign w:val="center"/>
+          </w:tcPr>
+          <w:p>
+            <w:pPr>
+              <w:spacing w:after="0" w:line="216" w:lineRule="auto"/>
+            </w:pPr>
+            <w:r>
+              <w:rPr>
+                <w:sz w:val="16"/>
+              </w:rPr>
+              <w:t>Exception note</w:t>
+            </w:r>
+          </w:p>
+        </w:tc>
+        <w:tc>
+          <w:tcPr>
+            <w:tcW w:type="dxa" w:w="2600"/>
+            <w:vAlign w:val="center"/>
+          </w:tcPr>
+          <w:p>
+            <w:pPr>
+              <w:spacing w:after="0" w:line="216" w:lineRule="auto"/>
+            </w:pPr>
+            <w:r>
+              <w:rPr>
+                <w:sz w:val="16"/>
+              </w:rPr>
+              <w:t>Preserve exception note with a return path</w:t>
+            </w:r>
+          </w:p>
+        </w:tc>
+        <w:tc>
+          <w:tcPr>
+            <w:tcW w:type="dxa" w:w="3480"/>
+            <w:vAlign w:val="center"/>
+          </w:tcPr>
+          <w:p>
+            <w:pPr>
+              <w:spacing w:after="0" w:line="216" w:lineRule="auto"/>
+            </w:pPr>
+            <w:r>
+              <w:rPr>
+                <w:sz w:val="16"/>
+              </w:rPr>
+              <w:t>If absent, disclose the exception note gap</w:t>
+            </w:r>
+          </w:p>
+        </w:tc>
+      </w:tr>
+      <w:tr>
+        <w:trPr>
+          <w:trHeight w:val="720" w:hRule="atLeast"/>
+        </w:trPr>
+        <w:tc>
+          <w:tcPr>
+            <w:tcW w:type="dxa" w:w="780"/>
+            <w:vAlign w:val="center"/>
+          </w:tcPr>
+          <w:p>
+            <w:pPr>
+              <w:spacing w:after="0" w:line="216" w:lineRule="auto"/>
+            </w:pPr>
+            <w:r>
+              <w:rPr>
+                <w:sz w:val="16"/>
+              </w:rPr>
+              <w:t>R-20</w:t>
+            </w:r>
+          </w:p>
+        </w:tc>
+        <w:tc>
+          <w:tcPr>
+            <w:tcW w:type="dxa" w:w="2100"/>
+            <w:vAlign w:val="center"/>
+          </w:tcPr>
+          <w:p>
+            <w:pPr>
+              <w:spacing w:after="0" w:line="216" w:lineRule="auto"/>
+            </w:pPr>
+            <w:r>
+              <w:rPr>
+                <w:sz w:val="16"/>
+              </w:rPr>
+              <w:t>Matrix cell</w:t>
+            </w:r>
+          </w:p>
+        </w:tc>
+        <w:tc>
+          <w:tcPr>
+            <w:tcW w:type="dxa" w:w="2600"/>
+            <w:vAlign w:val="center"/>
+          </w:tcPr>
+          <w:p>
+            <w:pPr>
+              <w:spacing w:after="0" w:line="216" w:lineRule="auto"/>
+            </w:pPr>
+            <w:r>
+              <w:rPr>
+                <w:sz w:val="16"/>
+              </w:rPr>
+              <w:t>Preserve matrix cell with a return path</w:t>
+            </w:r>
+          </w:p>
+        </w:tc>
+        <w:tc>
+          <w:tcPr>
+            <w:tcW w:type="dxa" w:w="3480"/>
+            <w:vAlign w:val="center"/>
+          </w:tcPr>
+          <w:p>
+            <w:pPr>
+              <w:spacing w:after="0" w:line="216" w:lineRule="auto"/>
+            </w:pPr>
+            <w:r>
+              <w:rPr>
+                <w:sz w:val="16"/>
+              </w:rPr>
+              <w:t>If absent, disclose the matrix cell gap</w:t>
+            </w:r>
+          </w:p>
+        </w:tc>
+      </w:tr>
+      <w:tr>
+        <w:trPr>
+          <w:trHeight w:val="720" w:hRule="atLeast"/>
+        </w:trPr>
+        <w:tc>
+          <w:tcPr>
+            <w:tcW w:type="dxa" w:w="780"/>
+            <w:vAlign w:val="center"/>
+          </w:tcPr>
+          <w:p>
+            <w:pPr>
+              <w:spacing w:after="0" w:line="216" w:lineRule="auto"/>
+            </w:pPr>
+            <w:r>
+              <w:rPr>
+                <w:sz w:val="16"/>
+              </w:rPr>
+              <w:t>R-21</w:t>
+            </w:r>
+          </w:p>
+        </w:tc>
+        <w:tc>
+          <w:tcPr>
+            <w:tcW w:type="dxa" w:w="2100"/>
+            <w:vAlign w:val="center"/>
+          </w:tcPr>
+          <w:p>
+            <w:pPr>
+              <w:spacing w:after="0" w:line="216" w:lineRule="auto"/>
+            </w:pPr>
+            <w:r>
+              <w:rPr>
+                <w:sz w:val="16"/>
+              </w:rPr>
+              <w:t>Register cell</w:t>
+            </w:r>
+          </w:p>
+        </w:tc>
+        <w:tc>
+          <w:tcPr>
+            <w:tcW w:type="dxa" w:w="2600"/>
+            <w:vAlign w:val="center"/>
+          </w:tcPr>
+          <w:p>
+            <w:pPr>
+              <w:spacing w:after="0" w:line="216" w:lineRule="auto"/>
+            </w:pPr>
+            <w:r>
+              <w:rPr>
+                <w:sz w:val="16"/>
+              </w:rPr>
+              <w:t>Preserve register cell with a return path</w:t>
+            </w:r>
+          </w:p>
+        </w:tc>
+        <w:tc>
+          <w:tcPr>
+            <w:tcW w:type="dxa" w:w="3480"/>
+            <w:vAlign w:val="center"/>
+          </w:tcPr>
+          <w:p>
+            <w:pPr>
+              <w:spacing w:after="0" w:line="216" w:lineRule="auto"/>
+            </w:pPr>
+            <w:r>
+              <w:rPr>
+                <w:sz w:val="16"/>
+              </w:rPr>
+              <w:t>If absent, disclose the register cell gap</w:t>
+            </w:r>
+          </w:p>
+        </w:tc>
+      </w:tr>
+      <w:tr>
+        <w:trPr>
+          <w:trHeight w:val="720" w:hRule="atLeast"/>
+        </w:trPr>
+        <w:tc>
+          <w:tcPr>
+            <w:tcW w:type="dxa" w:w="780"/>
+            <w:vAlign w:val="center"/>
+          </w:tcPr>
+          <w:p>
+            <w:pPr>
+              <w:spacing w:after="0" w:line="216" w:lineRule="auto"/>
+            </w:pPr>
+            <w:r>
+              <w:rPr>
+                <w:sz w:val="16"/>
+              </w:rPr>
+              <w:t>R-22</w:t>
+            </w:r>
+          </w:p>
+        </w:tc>
+        <w:tc>
+          <w:tcPr>
+            <w:tcW w:type="dxa" w:w="2100"/>
+            <w:vAlign w:val="center"/>
+          </w:tcPr>
+          <w:p>
+            <w:pPr>
+              <w:spacing w:after="0" w:line="216" w:lineRule="auto"/>
+            </w:pPr>
+            <w:r>
+              <w:rPr>
+                <w:sz w:val="16"/>
+              </w:rPr>
+              <w:t>Merged title</w:t>
+            </w:r>
+          </w:p>
+        </w:tc>
+        <w:tc>
+          <w:tcPr>
+            <w:tcW w:type="dxa" w:w="2600"/>
+            <w:vAlign w:val="center"/>
+          </w:tcPr>
+          <w:p>
+            <w:pPr>
+              <w:spacing w:after="0" w:line="216" w:lineRule="auto"/>
+            </w:pPr>
+            <w:r>
+              <w:rPr>
+                <w:sz w:val="16"/>
+              </w:rPr>
+              <w:t>Preserve merged title with a return path</w:t>
+            </w:r>
+          </w:p>
+        </w:tc>
+        <w:tc>
+          <w:tcPr>
+            <w:tcW w:type="dxa" w:w="3480"/>
+            <w:vAlign w:val="center"/>
+          </w:tcPr>
+          <w:p>
+            <w:pPr>
+              <w:spacing w:after="0" w:line="216" w:lineRule="auto"/>
+            </w:pPr>
+            <w:r>
+              <w:rPr>
+                <w:sz w:val="16"/>
+              </w:rPr>
+              <w:t>If absent, disclose the merged title gap</w:t>
+            </w:r>
+          </w:p>
+        </w:tc>
+      </w:tr>
+      <w:tr>
+        <w:trPr>
+          <w:trHeight w:val="720" w:hRule="atLeast"/>
+        </w:trPr>
+        <w:tc>
+          <w:tcPr>
+            <w:tcW w:type="dxa" w:w="780"/>
+            <w:vAlign w:val="center"/>
+          </w:tcPr>
+          <w:p>
+            <w:pPr>
+              <w:spacing w:after="0" w:line="216" w:lineRule="auto"/>
+            </w:pPr>
+            <w:r>
+              <w:rPr>
+                <w:sz w:val="16"/>
+              </w:rPr>
+              <w:t>R-23</w:t>
+            </w:r>
+          </w:p>
+        </w:tc>
+        <w:tc>
+          <w:tcPr>
+            <w:tcW w:type="dxa" w:w="2100"/>
+            <w:vAlign w:val="center"/>
+          </w:tcPr>
+          <w:p>
+            <w:pPr>
+              <w:spacing w:after="0" w:line="216" w:lineRule="auto"/>
+            </w:pPr>
+            <w:r>
+              <w:rPr>
+                <w:sz w:val="16"/>
+              </w:rPr>
+              <w:t>Alt text</w:t>
+            </w:r>
+          </w:p>
+        </w:tc>
+        <w:tc>
+          <w:tcPr>
+            <w:tcW w:type="dxa" w:w="2600"/>
+            <w:vAlign w:val="center"/>
+          </w:tcPr>
+          <w:p>
+            <w:pPr>
+              <w:spacing w:after="0" w:line="216" w:lineRule="auto"/>
+            </w:pPr>
+            <w:r>
+              <w:rPr>
+                <w:sz w:val="16"/>
+              </w:rPr>
+              <w:t>Preserve alt text with a return path</w:t>
+            </w:r>
+          </w:p>
+        </w:tc>
+        <w:tc>
+          <w:tcPr>
+            <w:tcW w:type="dxa" w:w="3480"/>
+            <w:vAlign w:val="center"/>
+          </w:tcPr>
+          <w:p>
+            <w:pPr>
+              <w:spacing w:after="0" w:line="216" w:lineRule="auto"/>
+            </w:pPr>
+            <w:r>
+              <w:rPr>
+                <w:sz w:val="16"/>
+              </w:rPr>
+              <w:t>If absent, disclose the alt text gap</w:t>
+            </w:r>
+          </w:p>
+        </w:tc>
+      </w:tr>
+      <w:tr>
+        <w:trPr>
+          <w:trHeight w:val="720" w:hRule="atLeast"/>
+        </w:trPr>
+        <w:tc>
+          <w:tcPr>
+            <w:tcW w:type="dxa" w:w="780"/>
+            <w:vAlign w:val="center"/>
+          </w:tcPr>
+          <w:p>
+            <w:pPr>
+              <w:spacing w:after="0" w:line="216" w:lineRule="auto"/>
+            </w:pPr>
+            <w:r>
+              <w:rPr>
+                <w:sz w:val="16"/>
+              </w:rPr>
+              <w:t>R-24</w:t>
+            </w:r>
+          </w:p>
+        </w:tc>
+        <w:tc>
+          <w:tcPr>
+            <w:tcW w:type="dxa" w:w="2100"/>
+            <w:vAlign w:val="center"/>
+          </w:tcPr>
+          <w:p>
+            <w:pPr>
+              <w:spacing w:after="0" w:line="216" w:lineRule="auto"/>
+            </w:pPr>
+            <w:r>
+              <w:rPr>
+                <w:sz w:val="16"/>
+              </w:rPr>
+              <w:t>Section break</w:t>
+            </w:r>
+          </w:p>
+        </w:tc>
+        <w:tc>
+          <w:tcPr>
+            <w:tcW w:type="dxa" w:w="2600"/>
+            <w:vAlign w:val="center"/>
+          </w:tcPr>
+          <w:p>
+            <w:pPr>
+              <w:spacing w:after="0" w:line="216" w:lineRule="auto"/>
+            </w:pPr>
+            <w:r>
+              <w:rPr>
+                <w:sz w:val="16"/>
+              </w:rPr>
+              <w:t>Preserve section break with a return path</w:t>
+            </w:r>
+          </w:p>
+        </w:tc>
+        <w:tc>
+          <w:tcPr>
+            <w:tcW w:type="dxa" w:w="3480"/>
+            <w:vAlign w:val="center"/>
+          </w:tcPr>
+          <w:p>
+            <w:pPr>
+              <w:spacing w:after="0" w:line="216" w:lineRule="auto"/>
+            </w:pPr>
+            <w:r>
+              <w:rPr>
+                <w:sz w:val="16"/>
+              </w:rPr>
+              <w:t>If absent, disclose the section break gap</w:t>
+            </w:r>
+          </w:p>
+        </w:tc>
+      </w:tr>
+      <w:tr>
+        <w:trPr>
+          <w:trHeight w:val="720" w:hRule="atLeast"/>
+        </w:trPr>
+        <w:tc>
+          <w:tcPr>
+            <w:tcW w:type="dxa" w:w="780"/>
+            <w:vAlign w:val="center"/>
+          </w:tcPr>
+          <w:p>
+            <w:pPr>
+              <w:spacing w:after="0" w:line="216" w:lineRule="auto"/>
+            </w:pPr>
+            <w:r>
+              <w:rPr>
+                <w:sz w:val="16"/>
+              </w:rPr>
+              <w:t>R-25</w:t>
+            </w:r>
+          </w:p>
+        </w:tc>
+        <w:tc>
+          <w:tcPr>
+            <w:tcW w:type="dxa" w:w="2100"/>
+            <w:vAlign w:val="center"/>
+          </w:tcPr>
+          <w:p>
+            <w:pPr>
+              <w:spacing w:after="0" w:line="216" w:lineRule="auto"/>
+            </w:pPr>
+            <w:r>
+              <w:rPr>
+                <w:sz w:val="16"/>
+              </w:rPr>
+              <w:t>Page break</w:t>
+            </w:r>
+          </w:p>
+        </w:tc>
+        <w:tc>
+          <w:tcPr>
+            <w:tcW w:type="dxa" w:w="2600"/>
+            <w:vAlign w:val="center"/>
+          </w:tcPr>
+          <w:p>
+            <w:pPr>
+              <w:spacing w:after="0" w:line="216" w:lineRule="auto"/>
+            </w:pPr>
+            <w:r>
+              <w:rPr>
+                <w:sz w:val="16"/>
+              </w:rPr>
+              <w:t>Preserve page break with a return path</w:t>
+            </w:r>
+          </w:p>
+        </w:tc>
+        <w:tc>
+          <w:tcPr>
+            <w:tcW w:type="dxa" w:w="3480"/>
+            <w:vAlign w:val="center"/>
+          </w:tcPr>
+          <w:p>
+            <w:pPr>
+              <w:spacing w:after="0" w:line="216" w:lineRule="auto"/>
+            </w:pPr>
+            <w:r>
+              <w:rPr>
+                <w:sz w:val="16"/>
+              </w:rPr>
+              <w:t>If absent, disclose the page break gap</w:t>
+            </w:r>
+          </w:p>
+        </w:tc>
+      </w:tr>
+      <w:tr>
+        <w:trPr>
+          <w:trHeight w:val="720" w:hRule="atLeast"/>
+        </w:trPr>
+        <w:tc>
+          <w:tcPr>
+            <w:tcW w:type="dxa" w:w="780"/>
+            <w:vAlign w:val="center"/>
+          </w:tcPr>
+          <w:p>
+            <w:pPr>
+              <w:spacing w:after="0" w:line="216" w:lineRule="auto"/>
+            </w:pPr>
+            <w:r>
+              <w:rPr>
+                <w:sz w:val="16"/>
+              </w:rPr>
+              <w:t>R-26</w:t>
+            </w:r>
+          </w:p>
+        </w:tc>
+        <w:tc>
+          <w:tcPr>
+            <w:tcW w:type="dxa" w:w="2100"/>
+            <w:vAlign w:val="center"/>
+          </w:tcPr>
+          <w:p>
+            <w:pPr>
+              <w:spacing w:after="0" w:line="216" w:lineRule="auto"/>
+            </w:pPr>
+            <w:r>
+              <w:rPr>
+                <w:sz w:val="16"/>
+              </w:rPr>
+              <w:t>Appendix heading</w:t>
+            </w:r>
+          </w:p>
+        </w:tc>
+        <w:tc>
+          <w:tcPr>
+            <w:tcW w:type="dxa" w:w="2600"/>
+            <w:vAlign w:val="center"/>
+          </w:tcPr>
+          <w:p>
+            <w:pPr>
+              <w:spacing w:after="0" w:line="216" w:lineRule="auto"/>
+            </w:pPr>
+            <w:r>
+              <w:rPr>
+                <w:sz w:val="16"/>
+              </w:rPr>
+              <w:t>Preserve appendix heading with a return path</w:t>
+            </w:r>
+          </w:p>
+        </w:tc>
+        <w:tc>
+          <w:tcPr>
+            <w:tcW w:type="dxa" w:w="3480"/>
+            <w:vAlign w:val="center"/>
+          </w:tcPr>
+          <w:p>
+            <w:pPr>
+              <w:spacing w:after="0" w:line="216" w:lineRule="auto"/>
+            </w:pPr>
+            <w:r>
+              <w:rPr>
+                <w:sz w:val="16"/>
+              </w:rPr>
+              <w:t>If absent, disclose the appendix heading gap</w:t>
+            </w:r>
+          </w:p>
+        </w:tc>
+      </w:tr>
+      <w:tr>
+        <w:trPr>
+          <w:trHeight w:val="720" w:hRule="atLeast"/>
+        </w:trPr>
+        <w:tc>
+          <w:tcPr>
+            <w:tcW w:type="dxa" w:w="780"/>
+            <w:vAlign w:val="center"/>
+          </w:tcPr>
+          <w:p>
+            <w:pPr>
+              <w:spacing w:after="0" w:line="216" w:lineRule="auto"/>
+            </w:pPr>
+            <w:r>
+              <w:rPr>
+                <w:sz w:val="16"/>
+              </w:rPr>
+              <w:t>R-27</w:t>
+            </w:r>
+          </w:p>
+        </w:tc>
+        <w:tc>
+          <w:tcPr>
+            <w:tcW w:type="dxa" w:w="2100"/>
+            <w:vAlign w:val="center"/>
+          </w:tcPr>
+          <w:p>
+            <w:pPr>
+              <w:spacing w:after="0" w:line="216" w:lineRule="auto"/>
+            </w:pPr>
+            <w:r>
+              <w:rPr>
+                <w:sz w:val="16"/>
+              </w:rPr>
+              <w:t>Appendix checklist</w:t>
+            </w:r>
+          </w:p>
+        </w:tc>
+        <w:tc>
+          <w:tcPr>
+            <w:tcW w:type="dxa" w:w="2600"/>
+            <w:vAlign w:val="center"/>
+          </w:tcPr>
+          <w:p>
+            <w:pPr>
+              <w:spacing w:after="0" w:line="216" w:lineRule="auto"/>
+            </w:pPr>
+            <w:r>
+              <w:rPr>
+                <w:sz w:val="16"/>
+              </w:rPr>
+              <w:t>Preserve appendix checklist with a return path</w:t>
+            </w:r>
+          </w:p>
+        </w:tc>
+        <w:tc>
+          <w:tcPr>
+            <w:tcW w:type="dxa" w:w="3480"/>
+            <w:vAlign w:val="center"/>
+          </w:tcPr>
+          <w:p>
+            <w:pPr>
+              <w:spacing w:after="0" w:line="216" w:lineRule="auto"/>
+            </w:pPr>
+            <w:r>
+              <w:rPr>
+                <w:sz w:val="16"/>
+              </w:rPr>
+              <w:t>If absent, disclose the appendix checklist gap</w:t>
+            </w:r>
+          </w:p>
+        </w:tc>
+      </w:tr>
+      <w:tr>
+        <w:trPr>
+          <w:trHeight w:val="720" w:hRule="atLeast"/>
+        </w:trPr>
+        <w:tc>
+          <w:tcPr>
+            <w:tcW w:type="dxa" w:w="780"/>
+            <w:vAlign w:val="center"/>
+          </w:tcPr>
+          <w:p>
+            <w:pPr>
+              <w:spacing w:after="0" w:line="216" w:lineRule="auto"/>
+            </w:pPr>
+            <w:r>
+              <w:rPr>
+                <w:sz w:val="16"/>
+              </w:rPr>
+              <w:t>R-28</w:t>
+            </w:r>
+          </w:p>
+        </w:tc>
+        <w:tc>
+          <w:tcPr>
+            <w:tcW w:type="dxa" w:w="2100"/>
+            <w:vAlign w:val="center"/>
+          </w:tcPr>
+          <w:p>
+            <w:pPr>
+              <w:spacing w:after="0" w:line="216" w:lineRule="auto"/>
+            </w:pPr>
+            <w:r>
+              <w:rPr>
+                <w:sz w:val="16"/>
+              </w:rPr>
+              <w:t>Provenance note</w:t>
+            </w:r>
+          </w:p>
+        </w:tc>
+        <w:tc>
+          <w:tcPr>
+            <w:tcW w:type="dxa" w:w="2600"/>
+            <w:vAlign w:val="center"/>
+          </w:tcPr>
+          <w:p>
+            <w:pPr>
+              <w:spacing w:after="0" w:line="216" w:lineRule="auto"/>
+            </w:pPr>
+            <w:r>
+              <w:rPr>
+                <w:sz w:val="16"/>
+              </w:rPr>
+              <w:t>Preserve provenance note with a return path</w:t>
+            </w:r>
+          </w:p>
+        </w:tc>
+        <w:tc>
+          <w:tcPr>
+            <w:tcW w:type="dxa" w:w="3480"/>
+            <w:vAlign w:val="center"/>
+          </w:tcPr>
+          <w:p>
+            <w:pPr>
+              <w:spacing w:after="0" w:line="216" w:lineRule="auto"/>
+            </w:pPr>
+            <w:r>
+              <w:rPr>
+                <w:sz w:val="16"/>
+              </w:rPr>
+              <w:t>If absent, disclose the provenance note gap</w:t>
+            </w:r>
+          </w:p>
+        </w:tc>
+      </w:tr>
+      <w:tr>
+        <w:trPr>
+          <w:trHeight w:val="720" w:hRule="atLeast"/>
+        </w:trPr>
+        <w:tc>
+          <w:tcPr>
+            <w:tcW w:type="dxa" w:w="780"/>
+            <w:vAlign w:val="center"/>
+          </w:tcPr>
+          <w:p>
+            <w:pPr>
+              <w:spacing w:after="0" w:line="216" w:lineRule="auto"/>
+            </w:pPr>
+            <w:r>
+              <w:rPr>
+                <w:sz w:val="16"/>
+              </w:rPr>
+              <w:t>R-29</w:t>
+            </w:r>
+          </w:p>
+        </w:tc>
+        <w:tc>
+          <w:tcPr>
+            <w:tcW w:type="dxa" w:w="2100"/>
+            <w:vAlign w:val="center"/>
+          </w:tcPr>
+          <w:p>
+            <w:pPr>
+              <w:spacing w:after="0" w:line="216" w:lineRule="auto"/>
+            </w:pPr>
+            <w:r>
+              <w:rPr>
+                <w:sz w:val="16"/>
+              </w:rPr>
+              <w:t>Version string</w:t>
+            </w:r>
+          </w:p>
+        </w:tc>
+        <w:tc>
+          <w:tcPr>
+            <w:tcW w:type="dxa" w:w="2600"/>
+            <w:vAlign w:val="center"/>
+          </w:tcPr>
+          <w:p>
+            <w:pPr>
+              <w:spacing w:after="0" w:line="216" w:lineRule="auto"/>
+            </w:pPr>
+            <w:r>
+              <w:rPr>
+                <w:sz w:val="16"/>
+              </w:rPr>
+              <w:t>Preserve version string with a return path</w:t>
+            </w:r>
+          </w:p>
+        </w:tc>
+        <w:tc>
+          <w:tcPr>
+            <w:tcW w:type="dxa" w:w="3480"/>
+            <w:vAlign w:val="center"/>
+          </w:tcPr>
+          <w:p>
+            <w:pPr>
+              <w:spacing w:after="0" w:line="216" w:lineRule="auto"/>
+            </w:pPr>
+            <w:r>
+              <w:rPr>
+                <w:sz w:val="16"/>
+              </w:rPr>
+              <w:t>If absent, disclose the version string gap</w:t>
+            </w:r>
+          </w:p>
+        </w:tc>
+      </w:tr>
+      <w:tr>
+        <w:trPr>
+          <w:trHeight w:val="720" w:hRule="atLeast"/>
+        </w:trPr>
+        <w:tc>
+          <w:tcPr>
+            <w:tcW w:type="dxa" w:w="780"/>
+            <w:vAlign w:val="center"/>
+          </w:tcPr>
+          <w:p>
+            <w:pPr>
+              <w:spacing w:after="0" w:line="216" w:lineRule="auto"/>
+            </w:pPr>
+            <w:r>
+              <w:rPr>
+                <w:sz w:val="16"/>
+              </w:rPr>
+              <w:t>R-30</w:t>
+            </w:r>
+          </w:p>
+        </w:tc>
+        <w:tc>
+          <w:tcPr>
+            <w:tcW w:type="dxa" w:w="2100"/>
+            <w:vAlign w:val="center"/>
+          </w:tcPr>
+          <w:p>
+            <w:pPr>
+              <w:spacing w:after="0" w:line="216" w:lineRule="auto"/>
+            </w:pPr>
+            <w:r>
+              <w:rPr>
+                <w:sz w:val="16"/>
+              </w:rPr>
+              <w:t>Object locator</w:t>
+            </w:r>
+          </w:p>
+        </w:tc>
+        <w:tc>
+          <w:tcPr>
+            <w:tcW w:type="dxa" w:w="2600"/>
+            <w:vAlign w:val="center"/>
+          </w:tcPr>
+          <w:p>
+            <w:pPr>
+              <w:spacing w:after="0" w:line="216" w:lineRule="auto"/>
+            </w:pPr>
+            <w:r>
+              <w:rPr>
+                <w:sz w:val="16"/>
+              </w:rPr>
+              <w:t>Preserve object locator with a return path</w:t>
+            </w:r>
+          </w:p>
+        </w:tc>
+        <w:tc>
+          <w:tcPr>
+            <w:tcW w:type="dxa" w:w="3480"/>
+            <w:vAlign w:val="center"/>
+          </w:tcPr>
+          <w:p>
+            <w:pPr>
+              <w:spacing w:after="0" w:line="216" w:lineRule="auto"/>
+            </w:pPr>
+            <w:r>
+              <w:rPr>
+                <w:sz w:val="16"/>
+              </w:rPr>
+              <w:t>If absent, disclose the object locator gap</w:t>
+            </w:r>
+          </w:p>
+        </w:tc>
+      </w:tr>
+      <w:tr>
+        <w:trPr>
+          <w:trHeight w:val="720" w:hRule="atLeast"/>
+        </w:trPr>
+        <w:tc>
+          <w:tcPr>
+            <w:tcW w:type="dxa" w:w="780"/>
+            <w:vAlign w:val="center"/>
+          </w:tcPr>
+          <w:p>
+            <w:pPr>
+              <w:spacing w:after="0" w:line="216" w:lineRule="auto"/>
+            </w:pPr>
+            <w:r>
+              <w:rPr>
+                <w:sz w:val="16"/>
+              </w:rPr>
+              <w:t>R-31</w:t>
+            </w:r>
+          </w:p>
+        </w:tc>
+        <w:tc>
+          <w:tcPr>
+            <w:tcW w:type="dxa" w:w="2100"/>
+            <w:vAlign w:val="center"/>
+          </w:tcPr>
+          <w:p>
+            <w:pPr>
+              <w:spacing w:after="0" w:line="216" w:lineRule="auto"/>
+            </w:pPr>
+            <w:r>
+              <w:rPr>
+                <w:sz w:val="16"/>
+              </w:rPr>
+              <w:t>Partial-result note</w:t>
+            </w:r>
+          </w:p>
+        </w:tc>
+        <w:tc>
+          <w:tcPr>
+            <w:tcW w:type="dxa" w:w="2600"/>
+            <w:vAlign w:val="center"/>
+          </w:tcPr>
+          <w:p>
+            <w:pPr>
+              <w:spacing w:after="0" w:line="216" w:lineRule="auto"/>
+            </w:pPr>
+            <w:r>
+              <w:rPr>
+                <w:sz w:val="16"/>
+              </w:rPr>
+              <w:t>Preserve partial-result note with a return path</w:t>
+            </w:r>
+          </w:p>
+        </w:tc>
+        <w:tc>
+          <w:tcPr>
+            <w:tcW w:type="dxa" w:w="3480"/>
+            <w:vAlign w:val="center"/>
+          </w:tcPr>
+          <w:p>
+            <w:pPr>
+              <w:spacing w:after="0" w:line="216" w:lineRule="auto"/>
+            </w:pPr>
+            <w:r>
+              <w:rPr>
+                <w:sz w:val="16"/>
+              </w:rPr>
+              <w:t>If absent, disclose the partial-result note gap</w:t>
+            </w:r>
+          </w:p>
+        </w:tc>
+      </w:tr>
+      <w:tr>
+        <w:trPr>
+          <w:trHeight w:val="720" w:hRule="atLeast"/>
+        </w:trPr>
+        <w:tc>
+          <w:tcPr>
+            <w:tcW w:type="dxa" w:w="780"/>
+            <w:vAlign w:val="center"/>
+          </w:tcPr>
+          <w:p>
+            <w:pPr>
+              <w:spacing w:after="0" w:line="216" w:lineRule="auto"/>
+            </w:pPr>
+            <w:r>
+              <w:rPr>
+                <w:sz w:val="16"/>
+              </w:rPr>
+              <w:t>R-32</w:t>
+            </w:r>
+          </w:p>
+        </w:tc>
+        <w:tc>
+          <w:tcPr>
+            <w:tcW w:type="dxa" w:w="2100"/>
+            <w:vAlign w:val="center"/>
+          </w:tcPr>
+          <w:p>
+            <w:pPr>
+              <w:spacing w:after="0" w:line="216" w:lineRule="auto"/>
+            </w:pPr>
+            <w:r>
+              <w:rPr>
+                <w:sz w:val="16"/>
+              </w:rPr>
+              <w:t>Final review</w:t>
+            </w:r>
+          </w:p>
+        </w:tc>
+        <w:tc>
+          <w:tcPr>
+            <w:tcW w:type="dxa" w:w="2600"/>
+            <w:vAlign w:val="center"/>
+          </w:tcPr>
+          <w:p>
+            <w:pPr>
+              <w:spacing w:after="0" w:line="216" w:lineRule="auto"/>
+            </w:pPr>
+            <w:r>
+              <w:rPr>
+                <w:sz w:val="16"/>
+              </w:rPr>
+              <w:t>Preserve final review with a return path</w:t>
+            </w:r>
+          </w:p>
+        </w:tc>
+        <w:tc>
+          <w:tcPr>
+            <w:tcW w:type="dxa" w:w="3480"/>
+            <w:vAlign w:val="center"/>
+          </w:tcPr>
+          <w:p>
+            <w:pPr>
+              <w:spacing w:after="0" w:line="216" w:lineRule="auto"/>
+            </w:pPr>
+            <w:r>
+              <w:rPr>
+                <w:sz w:val="16"/>
+              </w:rPr>
+              <w:t>If absent, disclose the final review gap</w:t>
             </w:r>
           </w:p>
         </w:tc>
@@ -435,7 +2916,23 @@
     </w:tbl>
     <w:p>
       <w:r>
-        <w:t>Source: anonymous synthetic measurements for #122.</w:t>
+        <w:br w:type="page"/>
+      </w:r>
+    </w:p>
+    <w:p>
+      <w:pPr>
+        <w:pStyle w:val="Heading1"/>
+      </w:pPr>
+      <w:r>
+        <w:t>Figure evidence</w:t>
+      </w:r>
+    </w:p>
+    <w:p>
+      <w:pPr>
+        <w:pStyle w:val="Heading2"/>
+      </w:pPr>
+      <w:r>
+        <w:t>Inline image and caption</w:t>
       </w:r>
     </w:p>
     <w:p>
@@ -445,8 +2942,8 @@
       <w:r>
         <w:drawing>
           <wp:inline xmlns:a="http://schemas.openxmlformats.org/drawingml/2006/main" xmlns:pic="http://schemas.openxmlformats.org/drawingml/2006/picture">
-            <wp:extent cx="5212080" cy="2432304"/>
-            <wp:docPr id="1" name="Picture 1" descr="Bar chart showing four synthetic parser quality profiles labeled A through D" title="Synthetic quality profile"/>
+            <wp:extent cx="5623560" cy="2811780"/>
+            <wp:docPr id="1" name="Picture 1" descr="Bar chart of four synthetic evidence-recovery dimensions"/>
             <wp:cNvGraphicFramePr>
               <a:graphicFrameLocks noChangeAspect="1"/>
             </wp:cNvGraphicFramePr>
@@ -458,7 +2955,7 @@
                     <pic:cNvPicPr/>
                   </pic:nvPicPr>
                   <pic:blipFill>
-                    <a:blip r:embed="rId10"/>
+                    <a:blip r:embed="rId11"/>
                     <a:stretch>
                       <a:fillRect/>
                     </a:stretch>
@@ -466,7 +2963,7 @@
                   <pic:spPr>
                     <a:xfrm>
                       <a:off x="0" y="0"/>
-                      <a:ext cx="5212080" cy="2432304"/>
+                      <a:ext cx="5623560" cy="2811780"/>
                     </a:xfrm>
                     <a:prstGeom prst="rect"/>
                   </pic:spPr>
@@ -479,14 +2976,24 @@
     </w:p>
     <w:p>
       <w:pPr>
+        <w:pStyle w:val="Caption"/>
         <w:jc w:val="center"/>
       </w:pPr>
       <w:r>
-        <w:rPr>
-          <w:i/>
-          <w:sz w:val="18"/>
-        </w:rPr>
-        <w:t>Figure 1. Synthetic quality profile used only to test image extraction.</w:t>
+        <w:t>Figure 1. Synthetic evidence-recovery profile used only for image and caption extraction.</w:t>
+      </w:r>
+    </w:p>
+    <w:p>
+      <w:pPr>
+        <w:pStyle w:val="Heading2"/>
+      </w:pPr>
+      <w:r>
+        <w:t>Reproducibility notes</w:t>
+      </w:r>
+    </w:p>
+    <w:p>
+      <w:r>
+        <w:t>The chart is inline rather than floating so the caption has a stable neighbouring relationship. The register ends before this section; an extractor must not report the figure as an additional register row.</w:t>
       </w:r>
     </w:p>
     <w:p>
@@ -499,12 +3006,7 @@
         <w:pStyle w:val="Heading1"/>
       </w:pPr>
       <w:r>
-        <w:t>3. Reproducibility notes</w:t>
-      </w:r>
-    </w:p>
-    <w:p>
-      <w:r>
-        <w:t>The sample is generated from source code and contains no personal names, private files, external URLs, or copied publication text. A parser may legitimately omit visual styling, but it must not change the meaning of the table or invent a description for the figure.</w:t>
+        <w:t>Appendix A: review procedure</w:t>
       </w:r>
     </w:p>
     <w:p>
@@ -512,7 +3014,83 @@
         <w:pStyle w:val="Heading2"/>
       </w:pPr>
       <w:r>
-        <w:t>3.1 References</w:t>
+        <w:t>Procedure detail</w:t>
+      </w:r>
+    </w:p>
+    <w:p>
+      <w:r>
+        <w:t>Reviewers first confirm document-level usefulness, then check diagnostic anchors. The two levels are intentionally separate: a document can contain all words while still losing the relationships that make a research claim inspectable.</w:t>
+      </w:r>
+    </w:p>
+    <w:p>
+      <w:pPr>
+        <w:pStyle w:val="Heading3"/>
+      </w:pPr>
+      <w:r>
+        <w:t>Structure audit</w:t>
+      </w:r>
+    </w:p>
+    <w:p>
+      <w:pPr>
+        <w:pStyle w:val="ListBullet"/>
+      </w:pPr>
+      <w:r>
+        <w:t>Confirm real Heading 1, Heading 2, and Heading 3 styles.</w:t>
+      </w:r>
+    </w:p>
+    <w:p>
+      <w:pPr>
+        <w:pStyle w:val="ListBullet"/>
+      </w:pPr>
+      <w:r>
+        <w:t>Confirm numbered paragraphs retain two levels.</w:t>
+      </w:r>
+    </w:p>
+    <w:p>
+      <w:pPr>
+        <w:pStyle w:val="ListBullet"/>
+      </w:pPr>
+      <w:r>
+        <w:t>Confirm merged table cell and repeated header are detectable.</w:t>
+      </w:r>
+    </w:p>
+    <w:p>
+      <w:pPr>
+        <w:pStyle w:val="ListBullet"/>
+      </w:pPr>
+      <w:r>
+        <w:t>Confirm inline image, Caption, footnote part, and PAGE field exist.</w:t>
+      </w:r>
+    </w:p>
+    <w:p>
+      <w:r>
+        <w:t>The long register on pages 4–5 is deliberately made of individual, meaningful records. A parser should preserve their order and header relationship, rather than joining them into one broad narrative paragraph.</w:t>
+      </w:r>
+    </w:p>
+    <w:p>
+      <w:r>
+        <w:br w:type="page"/>
+      </w:r>
+    </w:p>
+    <w:p>
+      <w:pPr>
+        <w:pStyle w:val="Heading1"/>
+      </w:pPr>
+      <w:r>
+        <w:t>Appendix B: sources and final checklist</w:t>
+      </w:r>
+    </w:p>
+    <w:p>
+      <w:r>
+        <w:t>All prose, data, and the chart in this DOCX are original synthetic benchmark material. The appendix is retained on its own page to test long-document navigation as well as final-page extraction.</w:t>
+      </w:r>
+    </w:p>
+    <w:p>
+      <w:pPr>
+        <w:pStyle w:val="Heading2"/>
+      </w:pPr>
+      <w:r>
+        <w:t>Reference list</w:t>
       </w:r>
     </w:p>
     <w:p>
@@ -520,7 +3098,7 @@
         <w:pStyle w:val="ListNumber"/>
       </w:pPr>
       <w:r>
-        <w:t>Example Standards Group. Structured office documents. Synthetic edition, 2025.</w:t>
+        <w:t>Collector Prototype. Complex office regression specification #122, 2026.</w:t>
       </w:r>
     </w:p>
     <w:p>
@@ -528,12 +3106,25 @@
         <w:pStyle w:val="ListNumber"/>
       </w:pPr>
       <w:r>
-        <w:t>Collector Project. Anonymous document parsing protocol #122, 2026.</w:t>
+        <w:t>Example Standards Group. Recoverable document evidence. Synthetic edition, 2026.</w:t>
+      </w:r>
+    </w:p>
+    <w:p>
+      <w:pPr>
+        <w:pStyle w:val="Heading2"/>
+      </w:pPr>
+      <w:r>
+        <w:t>Final review</w:t>
+      </w:r>
+    </w:p>
+    <w:p>
+      <w:r>
+        <w:t>Before accepting a result, confirm the source title, the repeated table header, the chart caption, the real footnote, and the footer page field. Any missing object must remain visible as a partial result rather than being filled with guessed content.</w:t>
       </w:r>
     </w:p>
     <w:sectPr>
       <w:headerReference w:type="default" r:id="rId9"/>
-      <w:footerReference w:type="default" r:id="rId11"/>
+      <w:footerReference w:type="default" r:id="rId10"/>
       <w:pgSz w:w="12240" w:h="15840"/>
       <w:pgMar w:top="1440" w:right="1440" w:bottom="1440" w:left="1440" w:header="708" w:footer="708" w:gutter="0"/>
       <w:cols w:space="720"/>
@@ -548,18 +3139,43 @@
   <w:p>
     <w:pPr>
       <w:pStyle w:val="Footer"/>
-      <w:jc w:val="center"/>
+      <w:jc w:val="right"/>
     </w:pPr>
     <w:r>
-      <w:rPr>
-        <w:rFonts w:ascii="Calibri" w:hAnsi="Calibri"/>
-        <w:color w:val="667085"/>
-        <w:sz w:val="16"/>
-      </w:rPr>
-      <w:t>Collector #122 · Anonymous synthetic DOCX regression sample</w:t>
+      <w:t xml:space="preserve">Collector #122 · Page </w:t>
     </w:r>
+    <w:fldSimple w:instr=" PAGE "/>
   </w:p>
 </w:ftr>
+</file>
+
+<file path=word/footnotes.xml><?xml version="1.0" encoding="utf-8"?>
+<w:footnotes xmlns:w="http://schemas.openxmlformats.org/wordprocessingml/2006/main">
+  <w:footnote w:type="separator" w:id="-1">
+    <w:p>
+      <w:r>
+        <w:separator/>
+      </w:r>
+    </w:p>
+  </w:footnote>
+  <w:footnote w:type="continuationSeparator" w:id="0">
+    <w:p>
+      <w:r>
+        <w:continuationSeparator/>
+      </w:r>
+    </w:p>
+  </w:footnote>
+  <w:footnote w:id="1">
+    <w:p>
+      <w:r>
+        <w:footnoteRef/>
+      </w:r>
+      <w:r>
+        <w:t> This footnote is a real OOXML note used to test source-return handling.</w:t>
+      </w:r>
+    </w:p>
+  </w:footnote>
+</w:footnotes>
 </file>
 
 <file path=word/header1.xml><?xml version="1.0" encoding="utf-8"?>
@@ -571,11 +3187,9 @@
     </w:pPr>
     <w:r>
       <w:rPr>
-        <w:rFonts w:ascii="Calibri" w:hAnsi="Calibri"/>
-        <w:color w:val="667085"/>
         <w:sz w:val="17"/>
       </w:rPr>
-      <w:t>TECHNICAL NOTE  |  ANONYMOUS SYNTHETIC SAMPLE</w:t>
+      <w:t>RESEARCH OPERATIONS BRIEF  |  SYNTHETIC COMPLEX DOCX</w:t>
     </w:r>
   </w:p>
 </w:hdr>
@@ -945,12 +3559,12 @@
     <w:qFormat/>
     <w:rsid w:val="00FC693F"/>
     <w:pPr>
-      <w:spacing w:before="0" w:after="120" w:line="264" w:lineRule="auto"/>
+      <w:spacing w:before="0" w:after="100" w:line="259" w:lineRule="auto"/>
     </w:pPr>
     <w:rPr>
       <w:rFonts w:ascii="Calibri" w:hAnsi="Calibri"/>
       <w:color w:val="000000"/>
-      <w:sz w:val="22"/>
+      <w:sz w:val="21"/>
     </w:rPr>
   </w:style>
   <w:style w:type="paragraph" w:styleId="Header">
@@ -1008,7 +3622,7 @@
     <w:pPr>
       <w:keepNext/>
       <w:keepLines/>
-      <w:spacing w:before="320" w:after="160" w:line="240" w:lineRule="auto"/>
+      <w:spacing w:before="300" w:after="140" w:line="240" w:lineRule="auto"/>
       <w:outlineLvl w:val="0"/>
     </w:pPr>
     <w:rPr>
@@ -1032,7 +3646,7 @@
     <w:pPr>
       <w:keepNext/>
       <w:keepLines/>
-      <w:spacing w:before="240" w:after="120" w:line="240" w:lineRule="auto"/>
+      <w:spacing w:before="220" w:after="100" w:line="240" w:lineRule="auto"/>
       <w:outlineLvl w:val="1"/>
     </w:pPr>
     <w:rPr>
@@ -1056,7 +3670,7 @@
     <w:pPr>
       <w:keepNext/>
       <w:keepLines/>
-      <w:spacing w:before="160" w:after="80" w:line="240" w:lineRule="auto"/>
+      <w:spacing w:before="140" w:after="60" w:line="240" w:lineRule="auto"/>
       <w:outlineLvl w:val="2"/>
     </w:pPr>
     <w:rPr>
@@ -1064,7 +3678,7 @@
       <w:b/>
       <w:bCs/>
       <w:color w:val="1F4D78"/>
-      <w:sz w:val="24"/>
+      <w:sz w:val="23"/>
     </w:rPr>
   </w:style>
   <w:style w:type="paragraph" w:styleId="Heading4">

</xml_diff>